<commit_message>
feat: Agregar puntos de manual_técnico
</commit_message>
<xml_diff>
--- a/Practica1/Informe de Desarrollo.docx
+++ b/Practica1/Informe de Desarrollo.docx
@@ -7144,7 +7144,7 @@
                     <pic:cNvPicPr/>
                   </pic:nvPicPr>
                   <pic:blipFill>
-                    <a:blip r:embed="rId5" cstate="print">
+                    <a:blip r:embed="rId7" cstate="print">
                       <a:extLst>
                         <a:ext uri="{28A0092B-C50C-407E-A947-70E740481C1C}">
                           <a14:useLocalDpi xmlns:a14="http://schemas.microsoft.com/office/drawing/2010/main" val="0"/>
@@ -7217,6 +7217,515 @@
     </w:p>
     <w:p>
       <w:pPr>
+        <w:pStyle w:val="NormalWeb"/>
+      </w:pPr>
+      <w:r>
+        <w:rPr>
+          <w:rStyle w:val="Textoennegrita"/>
+        </w:rPr>
+        <w:t>Tipo de medio:</w:t>
+      </w:r>
+      <w:r>
+        <w:t xml:space="preserve"> Se utiliza cable de cobre </w:t>
+      </w:r>
+      <w:r>
+        <w:rPr>
+          <w:rStyle w:val="Textoennegrita"/>
+        </w:rPr>
+        <w:t>UTP</w:t>
+      </w:r>
+      <w:r>
+        <w:t xml:space="preserve"> en la totalidad del edificio (troncal y horizontal). No se emplea fibra óptica, ya que las distancias máximas registradas en el diseño</w:t>
+      </w:r>
+      <w:r>
+        <w:t xml:space="preserve"> son menores de 30 metros. </w:t>
+      </w:r>
+      <w:r>
+        <w:t xml:space="preserve">están muy por debajo del límite de 100 m que soporta el cableado de cobre según el estándar TIA/EIA-568, </w:t>
+      </w:r>
+      <w:r>
+        <w:br/>
+      </w:r>
+      <w:r>
+        <w:t xml:space="preserve">por lo que el uso de fibra </w:t>
+      </w:r>
+      <w:r>
+        <w:t>significaría</w:t>
+      </w:r>
+      <w:r>
+        <w:t xml:space="preserve"> un sobrecosto injustificado para las necesidades del edificio.</w:t>
+      </w:r>
+    </w:p>
+    <w:p>
+      <w:pPr>
+        <w:pStyle w:val="NormalWeb"/>
+      </w:pPr>
+      <w:r>
+        <w:rPr>
+          <w:rStyle w:val="Textoennegrita"/>
+        </w:rPr>
+        <w:t>Categoría de cable:</w:t>
+      </w:r>
+      <w:r>
+        <w:t xml:space="preserve"> Se</w:t>
+      </w:r>
+      <w:r>
+        <w:t xml:space="preserve">leccioné </w:t>
+      </w:r>
+      <w:r>
+        <w:rPr>
+          <w:rStyle w:val="Textoennegrita"/>
+        </w:rPr>
+        <w:t>UTP Cat6</w:t>
+      </w:r>
+      <w:r>
+        <w:t xml:space="preserve"> de manera uniforme para todos los segmentos (troncal y horizontal), por las siguientes razones:</w:t>
+      </w:r>
+    </w:p>
+    <w:p>
+      <w:pPr>
+        <w:numPr>
+          <w:ilvl w:val="0"/>
+          <w:numId w:val="2"/>
+        </w:numPr>
+        <w:spacing w:before="100" w:beforeAutospacing="1" w:after="100" w:afterAutospacing="1" w:line="240" w:lineRule="auto"/>
+      </w:pPr>
+      <w:r>
+        <w:t xml:space="preserve">Soporta velocidades de hasta 10 Gbps a distancias de hasta ~55 m, y hasta 1 Gbps a los 100 m completos </w:t>
+      </w:r>
+      <w:r>
+        <w:t xml:space="preserve">esto es más que </w:t>
+      </w:r>
+      <w:r>
+        <w:t>suficiente para las distancias del diseño.</w:t>
+      </w:r>
+    </w:p>
+    <w:p>
+      <w:pPr>
+        <w:numPr>
+          <w:ilvl w:val="0"/>
+          <w:numId w:val="2"/>
+        </w:numPr>
+        <w:spacing w:before="100" w:beforeAutospacing="1" w:after="100" w:afterAutospacing="1" w:line="240" w:lineRule="auto"/>
+      </w:pPr>
+      <w:r>
+        <w:t>Es compatible con la capacidad Gigabit de los switches (Cisco 2960-24TT).</w:t>
+      </w:r>
+    </w:p>
+    <w:p>
+      <w:pPr>
+        <w:numPr>
+          <w:ilvl w:val="0"/>
+          <w:numId w:val="2"/>
+        </w:numPr>
+        <w:spacing w:before="100" w:beforeAutospacing="1" w:after="100" w:afterAutospacing="1" w:line="240" w:lineRule="auto"/>
+      </w:pPr>
+      <w:r>
+        <w:t>Deja margen de crecimiento a futuro sin necesidad de recablear, en caso de actualizar el equipo</w:t>
+      </w:r>
+      <w:r>
+        <w:t>.</w:t>
+      </w:r>
+    </w:p>
+    <w:tbl>
+      <w:tblPr>
+        <w:tblStyle w:val="Tablaconcuadrcula"/>
+        <w:tblpPr w:leftFromText="141" w:rightFromText="141" w:vertAnchor="text" w:horzAnchor="margin" w:tblpXSpec="center" w:tblpY="338"/>
+        <w:tblW w:w="10246" w:type="dxa"/>
+        <w:tblLook w:val="04A0" w:firstRow="1" w:lastRow="0" w:firstColumn="1" w:lastColumn="0" w:noHBand="0" w:noVBand="1"/>
+      </w:tblPr>
+      <w:tblGrid>
+        <w:gridCol w:w="2893"/>
+        <w:gridCol w:w="1674"/>
+        <w:gridCol w:w="1217"/>
+        <w:gridCol w:w="4462"/>
+      </w:tblGrid>
+      <w:tr>
+        <w:trPr>
+          <w:trHeight w:val="263"/>
+        </w:trPr>
+        <w:tc>
+          <w:tcPr>
+            <w:tcW w:w="2893" w:type="dxa"/>
+          </w:tcPr>
+          <w:p>
+            <w:pPr>
+              <w:spacing w:before="100" w:beforeAutospacing="1" w:after="100" w:afterAutospacing="1"/>
+              <w:rPr>
+                <w:b/>
+                <w:bCs/>
+              </w:rPr>
+            </w:pPr>
+            <w:r>
+              <w:rPr>
+                <w:b/>
+                <w:bCs/>
+              </w:rPr>
+              <w:t>Segmento</w:t>
+            </w:r>
+          </w:p>
+        </w:tc>
+        <w:tc>
+          <w:tcPr>
+            <w:tcW w:w="1674" w:type="dxa"/>
+          </w:tcPr>
+          <w:p>
+            <w:pPr>
+              <w:spacing w:before="100" w:beforeAutospacing="1" w:after="100" w:afterAutospacing="1"/>
+              <w:rPr>
+                <w:b/>
+                <w:bCs/>
+              </w:rPr>
+            </w:pPr>
+            <w:r>
+              <w:rPr>
+                <w:b/>
+                <w:bCs/>
+              </w:rPr>
+              <w:t>Tipo de cable</w:t>
+            </w:r>
+          </w:p>
+        </w:tc>
+        <w:tc>
+          <w:tcPr>
+            <w:tcW w:w="1217" w:type="dxa"/>
+          </w:tcPr>
+          <w:p>
+            <w:pPr>
+              <w:spacing w:before="100" w:beforeAutospacing="1" w:after="100" w:afterAutospacing="1"/>
+              <w:rPr>
+                <w:b/>
+                <w:bCs/>
+              </w:rPr>
+            </w:pPr>
+            <w:r>
+              <w:rPr>
+                <w:b/>
+                <w:bCs/>
+              </w:rPr>
+              <w:t>categoría</w:t>
+            </w:r>
+          </w:p>
+        </w:tc>
+        <w:tc>
+          <w:tcPr>
+            <w:tcW w:w="4462" w:type="dxa"/>
+          </w:tcPr>
+          <w:p>
+            <w:pPr>
+              <w:spacing w:before="100" w:beforeAutospacing="1" w:after="100" w:afterAutospacing="1"/>
+              <w:rPr>
+                <w:b/>
+                <w:bCs/>
+              </w:rPr>
+            </w:pPr>
+            <w:r>
+              <w:rPr>
+                <w:b/>
+                <w:bCs/>
+              </w:rPr>
+              <w:t xml:space="preserve">Justificación </w:t>
+            </w:r>
+          </w:p>
+        </w:tc>
+      </w:tr>
+      <w:tr>
+        <w:trPr>
+          <w:trHeight w:val="847"/>
+        </w:trPr>
+        <w:tc>
+          <w:tcPr>
+            <w:tcW w:w="2893" w:type="dxa"/>
+          </w:tcPr>
+          <w:p>
+            <w:pPr>
+              <w:spacing w:before="100" w:beforeAutospacing="1" w:after="100" w:afterAutospacing="1"/>
+              <w:rPr>
+                <w:b/>
+                <w:bCs/>
+              </w:rPr>
+            </w:pPr>
+            <w:r>
+              <w:rPr>
+                <w:b/>
+                <w:bCs/>
+              </w:rPr>
+              <w:t>Troncal (MDF ↔ switches de departamento)</w:t>
+            </w:r>
+          </w:p>
+        </w:tc>
+        <w:tc>
+          <w:tcPr>
+            <w:tcW w:w="1674" w:type="dxa"/>
+          </w:tcPr>
+          <w:p>
+            <w:pPr>
+              <w:spacing w:before="100" w:beforeAutospacing="1" w:after="100" w:afterAutospacing="1"/>
+              <w:jc w:val="center"/>
+            </w:pPr>
+            <w:r>
+              <w:t>UTP</w:t>
+            </w:r>
+          </w:p>
+        </w:tc>
+        <w:tc>
+          <w:tcPr>
+            <w:tcW w:w="1217" w:type="dxa"/>
+          </w:tcPr>
+          <w:p>
+            <w:pPr>
+              <w:spacing w:before="100" w:beforeAutospacing="1" w:after="100" w:afterAutospacing="1"/>
+              <w:jc w:val="center"/>
+            </w:pPr>
+            <w:r>
+              <w:t>Cat6</w:t>
+            </w:r>
+          </w:p>
+        </w:tc>
+        <w:tc>
+          <w:tcPr>
+            <w:tcW w:w="4462" w:type="dxa"/>
+          </w:tcPr>
+          <w:p>
+            <w:pPr>
+              <w:pStyle w:val="HTMLconformatoprevio"/>
+              <w:rPr>
+                <w:rFonts w:asciiTheme="minorHAnsi" w:hAnsiTheme="minorHAnsi" w:cstheme="minorHAnsi"/>
+              </w:rPr>
+            </w:pPr>
+            <w:r>
+              <w:rPr>
+                <w:rStyle w:val="CdigoHTML"/>
+                <w:rFonts w:asciiTheme="minorHAnsi" w:hAnsiTheme="minorHAnsi" w:cstheme="minorHAnsi"/>
+              </w:rPr>
+              <w:t xml:space="preserve">las Distancias son menores que 30 metros (≤ 30 m), compatible con </w:t>
+            </w:r>
+            <w:proofErr w:type="spellStart"/>
+            <w:r>
+              <w:rPr>
+                <w:rStyle w:val="CdigoHTML"/>
+                <w:rFonts w:asciiTheme="minorHAnsi" w:hAnsiTheme="minorHAnsi" w:cstheme="minorHAnsi"/>
+              </w:rPr>
+              <w:t>uplink</w:t>
+            </w:r>
+            <w:proofErr w:type="spellEnd"/>
+            <w:r>
+              <w:rPr>
+                <w:rStyle w:val="CdigoHTML"/>
+                <w:rFonts w:asciiTheme="minorHAnsi" w:hAnsiTheme="minorHAnsi" w:cstheme="minorHAnsi"/>
+              </w:rPr>
+              <w:t xml:space="preserve"> Gigabit</w:t>
+            </w:r>
+          </w:p>
+        </w:tc>
+      </w:tr>
+      <w:tr>
+        <w:trPr>
+          <w:trHeight w:val="583"/>
+        </w:trPr>
+        <w:tc>
+          <w:tcPr>
+            <w:tcW w:w="2893" w:type="dxa"/>
+          </w:tcPr>
+          <w:p>
+            <w:pPr>
+              <w:spacing w:before="100" w:beforeAutospacing="1" w:after="100" w:afterAutospacing="1"/>
+              <w:rPr>
+                <w:b/>
+                <w:bCs/>
+              </w:rPr>
+            </w:pPr>
+            <w:r>
+              <w:rPr>
+                <w:b/>
+                <w:bCs/>
+              </w:rPr>
+              <w:t>Troncal (MDF ↔ switch Data Center)</w:t>
+            </w:r>
+          </w:p>
+        </w:tc>
+        <w:tc>
+          <w:tcPr>
+            <w:tcW w:w="1674" w:type="dxa"/>
+          </w:tcPr>
+          <w:p>
+            <w:pPr>
+              <w:spacing w:before="100" w:beforeAutospacing="1" w:after="100" w:afterAutospacing="1"/>
+              <w:jc w:val="center"/>
+            </w:pPr>
+            <w:r>
+              <w:t>UTP</w:t>
+            </w:r>
+          </w:p>
+        </w:tc>
+        <w:tc>
+          <w:tcPr>
+            <w:tcW w:w="1217" w:type="dxa"/>
+          </w:tcPr>
+          <w:p>
+            <w:pPr>
+              <w:spacing w:before="100" w:beforeAutospacing="1" w:after="100" w:afterAutospacing="1"/>
+              <w:jc w:val="center"/>
+              <w:rPr>
+                <w:rFonts w:cstheme="minorHAnsi"/>
+              </w:rPr>
+            </w:pPr>
+            <w:r>
+              <w:rPr>
+                <w:rFonts w:cstheme="minorHAnsi"/>
+              </w:rPr>
+              <w:t>Cat6</w:t>
+            </w:r>
+          </w:p>
+        </w:tc>
+        <w:tc>
+          <w:tcPr>
+            <w:tcW w:w="4462" w:type="dxa"/>
+          </w:tcPr>
+          <w:p>
+            <w:pPr>
+              <w:pStyle w:val="HTMLconformatoprevio"/>
+              <w:rPr>
+                <w:rFonts w:asciiTheme="minorHAnsi" w:hAnsiTheme="minorHAnsi" w:cstheme="minorHAnsi"/>
+              </w:rPr>
+            </w:pPr>
+            <w:r>
+              <w:rPr>
+                <w:rStyle w:val="CdigoHTML"/>
+                <w:rFonts w:asciiTheme="minorHAnsi" w:hAnsiTheme="minorHAnsi" w:cstheme="minorHAnsi"/>
+              </w:rPr>
+              <w:t>El Enlace es mucho más corto (3 m) y cabe destacar que es dentro del mismo cuarto</w:t>
+            </w:r>
+          </w:p>
+          <w:p>
+            <w:pPr>
+              <w:spacing w:before="100" w:beforeAutospacing="1" w:after="100" w:afterAutospacing="1"/>
+              <w:rPr>
+                <w:rFonts w:cstheme="minorHAnsi"/>
+              </w:rPr>
+            </w:pPr>
+          </w:p>
+        </w:tc>
+      </w:tr>
+      <w:tr>
+        <w:trPr>
+          <w:trHeight w:val="683"/>
+        </w:trPr>
+        <w:tc>
+          <w:tcPr>
+            <w:tcW w:w="2893" w:type="dxa"/>
+          </w:tcPr>
+          <w:p>
+            <w:pPr>
+              <w:spacing w:before="100" w:beforeAutospacing="1" w:after="100" w:afterAutospacing="1"/>
+              <w:rPr>
+                <w:b/>
+                <w:bCs/>
+              </w:rPr>
+            </w:pPr>
+            <w:r>
+              <w:rPr>
+                <w:b/>
+                <w:bCs/>
+              </w:rPr>
+              <w:t>Horizontal (switch ↔ hosts)</w:t>
+            </w:r>
+          </w:p>
+        </w:tc>
+        <w:tc>
+          <w:tcPr>
+            <w:tcW w:w="1674" w:type="dxa"/>
+          </w:tcPr>
+          <w:p>
+            <w:pPr>
+              <w:spacing w:before="100" w:beforeAutospacing="1" w:after="100" w:afterAutospacing="1"/>
+              <w:jc w:val="center"/>
+            </w:pPr>
+            <w:r>
+              <w:t>UTP</w:t>
+            </w:r>
+          </w:p>
+        </w:tc>
+        <w:tc>
+          <w:tcPr>
+            <w:tcW w:w="1217" w:type="dxa"/>
+          </w:tcPr>
+          <w:p>
+            <w:pPr>
+              <w:spacing w:before="100" w:beforeAutospacing="1" w:after="100" w:afterAutospacing="1"/>
+              <w:jc w:val="center"/>
+            </w:pPr>
+            <w:r>
+              <w:t>Cat6</w:t>
+            </w:r>
+          </w:p>
+        </w:tc>
+        <w:tc>
+          <w:tcPr>
+            <w:tcW w:w="4462" w:type="dxa"/>
+          </w:tcPr>
+          <w:p>
+            <w:pPr>
+              <w:tabs>
+                <w:tab w:val="left" w:pos="916"/>
+                <w:tab w:val="left" w:pos="1832"/>
+                <w:tab w:val="left" w:pos="2748"/>
+                <w:tab w:val="left" w:pos="3664"/>
+                <w:tab w:val="left" w:pos="4580"/>
+                <w:tab w:val="left" w:pos="5496"/>
+                <w:tab w:val="left" w:pos="6412"/>
+                <w:tab w:val="left" w:pos="7328"/>
+                <w:tab w:val="left" w:pos="8244"/>
+                <w:tab w:val="left" w:pos="9160"/>
+                <w:tab w:val="left" w:pos="10076"/>
+                <w:tab w:val="left" w:pos="10992"/>
+                <w:tab w:val="left" w:pos="11908"/>
+                <w:tab w:val="left" w:pos="12824"/>
+                <w:tab w:val="left" w:pos="13740"/>
+                <w:tab w:val="left" w:pos="14656"/>
+              </w:tabs>
+              <w:spacing w:after="0" w:line="240" w:lineRule="auto"/>
+              <w:rPr>
+                <w:rFonts w:eastAsia="Times New Roman" w:cstheme="minorHAnsi"/>
+                <w:sz w:val="20"/>
+                <w:szCs w:val="20"/>
+                <w:lang w:eastAsia="es-MX"/>
+              </w:rPr>
+            </w:pPr>
+            <w:r>
+              <w:rPr>
+                <w:rFonts w:eastAsia="Times New Roman" w:cstheme="minorHAnsi"/>
+                <w:sz w:val="20"/>
+                <w:szCs w:val="20"/>
+                <w:lang w:eastAsia="es-MX"/>
+              </w:rPr>
+              <w:t>Estándar homogéneo, soporta Gigabit por host, escalable a futuro</w:t>
+            </w:r>
+          </w:p>
+          <w:p>
+            <w:pPr>
+              <w:spacing w:before="100" w:beforeAutospacing="1" w:after="100" w:afterAutospacing="1"/>
+              <w:rPr>
+                <w:rFonts w:cstheme="minorHAnsi"/>
+              </w:rPr>
+            </w:pPr>
+          </w:p>
+        </w:tc>
+      </w:tr>
+    </w:tbl>
+    <w:p>
+      <w:pPr>
+        <w:spacing w:before="100" w:beforeAutospacing="1" w:after="100" w:afterAutospacing="1" w:line="240" w:lineRule="auto"/>
+      </w:pPr>
+    </w:p>
+    <w:p>
+      <w:pPr>
+        <w:spacing w:before="100" w:beforeAutospacing="1" w:after="100" w:afterAutospacing="1" w:line="240" w:lineRule="auto"/>
+      </w:pPr>
+    </w:p>
+    <w:p/>
+    <w:p>
+      <w:pPr>
         <w:rPr>
           <w:rFonts w:cstheme="minorHAnsi"/>
           <w:b/>
@@ -7227,7 +7736,9 @@
           <w:shd w:val="clear" w:color="auto" w:fill="FFFFFF"/>
         </w:rPr>
       </w:pPr>
-      <w:r>
+    </w:p>
+    <w:p>
+      <w:pPr>
         <w:rPr>
           <w:rFonts w:cstheme="minorHAnsi"/>
           <w:b/>
@@ -7237,9 +7748,10 @@
           <w:szCs w:val="21"/>
           <w:shd w:val="clear" w:color="auto" w:fill="FFFFFF"/>
         </w:rPr>
-        <w:t>UTP Cat53, Cat 6, Cat6a o fibra</w:t>
-      </w:r>
-      <w:r>
+      </w:pPr>
+    </w:p>
+    <w:p>
+      <w:pPr>
         <w:rPr>
           <w:rFonts w:cstheme="minorHAnsi"/>
           <w:b/>
@@ -7249,34 +7761,7 @@
           <w:szCs w:val="21"/>
           <w:shd w:val="clear" w:color="auto" w:fill="FFFFFF"/>
         </w:rPr>
-        <w:br/>
-        <w:t>tanto como para el cableado horizontal (switch-host)</w:t>
-      </w:r>
-    </w:p>
-    <w:p>
-      <w:pPr>
-        <w:rPr>
-          <w:rFonts w:cstheme="minorHAnsi"/>
-          <w:b/>
-          <w:bCs/>
-          <w:color w:val="000000" w:themeColor="text1"/>
-          <w:sz w:val="21"/>
-          <w:szCs w:val="21"/>
-          <w:shd w:val="clear" w:color="auto" w:fill="FFFFFF"/>
-        </w:rPr>
       </w:pPr>
-      <w:r>
-        <w:rPr>
-          <w:rFonts w:cstheme="minorHAnsi"/>
-          <w:b/>
-          <w:bCs/>
-          <w:color w:val="000000" w:themeColor="text1"/>
-          <w:sz w:val="21"/>
-          <w:szCs w:val="21"/>
-          <w:shd w:val="clear" w:color="auto" w:fill="FFFFFF"/>
-        </w:rPr>
-        <w:t>Como el troncal (MDF-switch)</w:t>
-      </w:r>
     </w:p>
     <w:p>
       <w:pPr>
@@ -7377,6 +7862,56 @@
     </w:sectPr>
   </w:body>
 </w:document>
+</file>
+
+<file path=word/endnotes.xml><?xml version="1.0" encoding="utf-8"?>
+<w:endnotes xmlns:wpc="http://schemas.microsoft.com/office/word/2010/wordprocessingCanvas" xmlns:cx="http://schemas.microsoft.com/office/drawing/2014/chartex" xmlns:cx1="http://schemas.microsoft.com/office/drawing/2015/9/8/chartex" xmlns:cx2="http://schemas.microsoft.com/office/drawing/2015/10/21/chartex" xmlns:cx3="http://schemas.microsoft.com/office/drawing/2016/5/9/chartex" xmlns:cx4="http://schemas.microsoft.com/office/drawing/2016/5/10/chartex" xmlns:cx5="http://schemas.microsoft.com/office/drawing/2016/5/11/chartex" xmlns:cx6="http://schemas.microsoft.com/office/drawing/2016/5/12/chartex" xmlns:cx7="http://schemas.microsoft.com/office/drawing/2016/5/13/chartex" xmlns:cx8="http://schemas.microsoft.com/office/drawing/2016/5/14/chartex" xmlns:mc="http://schemas.openxmlformats.org/markup-compatibility/2006" xmlns:aink="http://schemas.microsoft.com/office/drawing/2016/ink" xmlns:am3d="http://schemas.microsoft.com/office/drawing/2017/model3d" xmlns:o="urn:schemas-microsoft-com:office:office" xmlns:oel="http://schemas.microsoft.com/office/2019/extlst" xmlns:r="http://schemas.openxmlformats.org/officeDocument/2006/relationships" xmlns:m="http://schemas.openxmlformats.org/officeDocument/2006/math" xmlns:v="urn:schemas-microsoft-com:vml" xmlns:wp14="http://schemas.microsoft.com/office/word/2010/wordprocessingDrawing" xmlns:wp="http://schemas.openxmlformats.org/drawingml/2006/wordprocessingDrawing" xmlns:w10="urn:schemas-microsoft-com:office:word" xmlns:w="http://schemas.openxmlformats.org/wordprocessingml/2006/main" xmlns:w14="http://schemas.microsoft.com/office/word/2010/wordml" xmlns:w15="http://schemas.microsoft.com/office/word/2012/wordml" xmlns:w16cex="http://schemas.microsoft.com/office/word/2018/wordml/cex" xmlns:w16cid="http://schemas.microsoft.com/office/word/2016/wordml/cid" xmlns:w16="http://schemas.microsoft.com/office/word/2018/wordml" xmlns:w16sdtdh="http://schemas.microsoft.com/office/word/2020/wordml/sdtdatahash" xmlns:w16se="http://schemas.microsoft.com/office/word/2015/wordml/symex" xmlns:wpg="http://schemas.microsoft.com/office/word/2010/wordprocessingGroup" xmlns:wpi="http://schemas.microsoft.com/office/word/2010/wordprocessingInk" xmlns:wne="http://schemas.microsoft.com/office/word/2006/wordml" xmlns:wps="http://schemas.microsoft.com/office/word/2010/wordprocessingShape" mc:Ignorable="w14 w15 w16se w16cid w16 w16cex w16sdtdh wp14">
+  <w:endnote w:type="separator" w:id="-1">
+    <w:p>
+      <w:pPr>
+        <w:spacing w:after="0" w:line="240" w:lineRule="auto"/>
+      </w:pPr>
+      <w:r>
+        <w:separator/>
+      </w:r>
+    </w:p>
+  </w:endnote>
+  <w:endnote w:type="continuationSeparator" w:id="0">
+    <w:p>
+      <w:pPr>
+        <w:spacing w:after="0" w:line="240" w:lineRule="auto"/>
+      </w:pPr>
+      <w:r>
+        <w:continuationSeparator/>
+      </w:r>
+    </w:p>
+  </w:endnote>
+</w:endnotes>
+</file>
+
+<file path=word/footnotes.xml><?xml version="1.0" encoding="utf-8"?>
+<w:footnotes xmlns:wpc="http://schemas.microsoft.com/office/word/2010/wordprocessingCanvas" xmlns:cx="http://schemas.microsoft.com/office/drawing/2014/chartex" xmlns:cx1="http://schemas.microsoft.com/office/drawing/2015/9/8/chartex" xmlns:cx2="http://schemas.microsoft.com/office/drawing/2015/10/21/chartex" xmlns:cx3="http://schemas.microsoft.com/office/drawing/2016/5/9/chartex" xmlns:cx4="http://schemas.microsoft.com/office/drawing/2016/5/10/chartex" xmlns:cx5="http://schemas.microsoft.com/office/drawing/2016/5/11/chartex" xmlns:cx6="http://schemas.microsoft.com/office/drawing/2016/5/12/chartex" xmlns:cx7="http://schemas.microsoft.com/office/drawing/2016/5/13/chartex" xmlns:cx8="http://schemas.microsoft.com/office/drawing/2016/5/14/chartex" xmlns:mc="http://schemas.openxmlformats.org/markup-compatibility/2006" xmlns:aink="http://schemas.microsoft.com/office/drawing/2016/ink" xmlns:am3d="http://schemas.microsoft.com/office/drawing/2017/model3d" xmlns:o="urn:schemas-microsoft-com:office:office" xmlns:oel="http://schemas.microsoft.com/office/2019/extlst" xmlns:r="http://schemas.openxmlformats.org/officeDocument/2006/relationships" xmlns:m="http://schemas.openxmlformats.org/officeDocument/2006/math" xmlns:v="urn:schemas-microsoft-com:vml" xmlns:wp14="http://schemas.microsoft.com/office/word/2010/wordprocessingDrawing" xmlns:wp="http://schemas.openxmlformats.org/drawingml/2006/wordprocessingDrawing" xmlns:w10="urn:schemas-microsoft-com:office:word" xmlns:w="http://schemas.openxmlformats.org/wordprocessingml/2006/main" xmlns:w14="http://schemas.microsoft.com/office/word/2010/wordml" xmlns:w15="http://schemas.microsoft.com/office/word/2012/wordml" xmlns:w16cex="http://schemas.microsoft.com/office/word/2018/wordml/cex" xmlns:w16cid="http://schemas.microsoft.com/office/word/2016/wordml/cid" xmlns:w16="http://schemas.microsoft.com/office/word/2018/wordml" xmlns:w16sdtdh="http://schemas.microsoft.com/office/word/2020/wordml/sdtdatahash" xmlns:w16se="http://schemas.microsoft.com/office/word/2015/wordml/symex" xmlns:wpg="http://schemas.microsoft.com/office/word/2010/wordprocessingGroup" xmlns:wpi="http://schemas.microsoft.com/office/word/2010/wordprocessingInk" xmlns:wne="http://schemas.microsoft.com/office/word/2006/wordml" xmlns:wps="http://schemas.microsoft.com/office/word/2010/wordprocessingShape" mc:Ignorable="w14 w15 w16se w16cid w16 w16cex w16sdtdh wp14">
+  <w:footnote w:type="separator" w:id="-1">
+    <w:p>
+      <w:pPr>
+        <w:spacing w:after="0" w:line="240" w:lineRule="auto"/>
+      </w:pPr>
+      <w:r>
+        <w:separator/>
+      </w:r>
+    </w:p>
+  </w:footnote>
+  <w:footnote w:type="continuationSeparator" w:id="0">
+    <w:p>
+      <w:pPr>
+        <w:spacing w:after="0" w:line="240" w:lineRule="auto"/>
+      </w:pPr>
+      <w:r>
+        <w:continuationSeparator/>
+      </w:r>
+    </w:p>
+  </w:footnote>
+</w:footnotes>
 </file>
 
 <file path=word/numbering.xml><?xml version="1.0" encoding="utf-8"?>
@@ -7530,8 +8065,160 @@
       </w:rPr>
     </w:lvl>
   </w:abstractNum>
+  <w:abstractNum w:abstractNumId="1" w15:restartNumberingAfterBreak="0">
+    <w:nsid w:val="4A32297F"/>
+    <w:multiLevelType w:val="multilevel"/>
+    <w:tmpl w:val="2C24EC5E"/>
+    <w:lvl w:ilvl="0">
+      <w:start w:val="1"/>
+      <w:numFmt w:val="bullet"/>
+      <w:lvlText w:val=""/>
+      <w:lvlJc w:val="left"/>
+      <w:pPr>
+        <w:tabs>
+          <w:tab w:val="num" w:pos="720"/>
+        </w:tabs>
+        <w:ind w:left="720" w:hanging="360"/>
+      </w:pPr>
+      <w:rPr>
+        <w:rFonts w:ascii="Symbol" w:hAnsi="Symbol" w:hint="default"/>
+        <w:sz w:val="20"/>
+      </w:rPr>
+    </w:lvl>
+    <w:lvl w:ilvl="1" w:tentative="1">
+      <w:start w:val="1"/>
+      <w:numFmt w:val="bullet"/>
+      <w:lvlText w:val="o"/>
+      <w:lvlJc w:val="left"/>
+      <w:pPr>
+        <w:tabs>
+          <w:tab w:val="num" w:pos="1440"/>
+        </w:tabs>
+        <w:ind w:left="1440" w:hanging="360"/>
+      </w:pPr>
+      <w:rPr>
+        <w:rFonts w:ascii="Courier New" w:hAnsi="Courier New" w:hint="default"/>
+        <w:sz w:val="20"/>
+      </w:rPr>
+    </w:lvl>
+    <w:lvl w:ilvl="2" w:tentative="1">
+      <w:start w:val="1"/>
+      <w:numFmt w:val="bullet"/>
+      <w:lvlText w:val=""/>
+      <w:lvlJc w:val="left"/>
+      <w:pPr>
+        <w:tabs>
+          <w:tab w:val="num" w:pos="2160"/>
+        </w:tabs>
+        <w:ind w:left="2160" w:hanging="360"/>
+      </w:pPr>
+      <w:rPr>
+        <w:rFonts w:ascii="Wingdings" w:hAnsi="Wingdings" w:hint="default"/>
+        <w:sz w:val="20"/>
+      </w:rPr>
+    </w:lvl>
+    <w:lvl w:ilvl="3" w:tentative="1">
+      <w:start w:val="1"/>
+      <w:numFmt w:val="bullet"/>
+      <w:lvlText w:val=""/>
+      <w:lvlJc w:val="left"/>
+      <w:pPr>
+        <w:tabs>
+          <w:tab w:val="num" w:pos="2880"/>
+        </w:tabs>
+        <w:ind w:left="2880" w:hanging="360"/>
+      </w:pPr>
+      <w:rPr>
+        <w:rFonts w:ascii="Wingdings" w:hAnsi="Wingdings" w:hint="default"/>
+        <w:sz w:val="20"/>
+      </w:rPr>
+    </w:lvl>
+    <w:lvl w:ilvl="4" w:tentative="1">
+      <w:start w:val="1"/>
+      <w:numFmt w:val="bullet"/>
+      <w:lvlText w:val=""/>
+      <w:lvlJc w:val="left"/>
+      <w:pPr>
+        <w:tabs>
+          <w:tab w:val="num" w:pos="3600"/>
+        </w:tabs>
+        <w:ind w:left="3600" w:hanging="360"/>
+      </w:pPr>
+      <w:rPr>
+        <w:rFonts w:ascii="Wingdings" w:hAnsi="Wingdings" w:hint="default"/>
+        <w:sz w:val="20"/>
+      </w:rPr>
+    </w:lvl>
+    <w:lvl w:ilvl="5" w:tentative="1">
+      <w:start w:val="1"/>
+      <w:numFmt w:val="bullet"/>
+      <w:lvlText w:val=""/>
+      <w:lvlJc w:val="left"/>
+      <w:pPr>
+        <w:tabs>
+          <w:tab w:val="num" w:pos="4320"/>
+        </w:tabs>
+        <w:ind w:left="4320" w:hanging="360"/>
+      </w:pPr>
+      <w:rPr>
+        <w:rFonts w:ascii="Wingdings" w:hAnsi="Wingdings" w:hint="default"/>
+        <w:sz w:val="20"/>
+      </w:rPr>
+    </w:lvl>
+    <w:lvl w:ilvl="6" w:tentative="1">
+      <w:start w:val="1"/>
+      <w:numFmt w:val="bullet"/>
+      <w:lvlText w:val=""/>
+      <w:lvlJc w:val="left"/>
+      <w:pPr>
+        <w:tabs>
+          <w:tab w:val="num" w:pos="5040"/>
+        </w:tabs>
+        <w:ind w:left="5040" w:hanging="360"/>
+      </w:pPr>
+      <w:rPr>
+        <w:rFonts w:ascii="Wingdings" w:hAnsi="Wingdings" w:hint="default"/>
+        <w:sz w:val="20"/>
+      </w:rPr>
+    </w:lvl>
+    <w:lvl w:ilvl="7" w:tentative="1">
+      <w:start w:val="1"/>
+      <w:numFmt w:val="bullet"/>
+      <w:lvlText w:val=""/>
+      <w:lvlJc w:val="left"/>
+      <w:pPr>
+        <w:tabs>
+          <w:tab w:val="num" w:pos="5760"/>
+        </w:tabs>
+        <w:ind w:left="5760" w:hanging="360"/>
+      </w:pPr>
+      <w:rPr>
+        <w:rFonts w:ascii="Wingdings" w:hAnsi="Wingdings" w:hint="default"/>
+        <w:sz w:val="20"/>
+      </w:rPr>
+    </w:lvl>
+    <w:lvl w:ilvl="8" w:tentative="1">
+      <w:start w:val="1"/>
+      <w:numFmt w:val="bullet"/>
+      <w:lvlText w:val=""/>
+      <w:lvlJc w:val="left"/>
+      <w:pPr>
+        <w:tabs>
+          <w:tab w:val="num" w:pos="6480"/>
+        </w:tabs>
+        <w:ind w:left="6480" w:hanging="360"/>
+      </w:pPr>
+      <w:rPr>
+        <w:rFonts w:ascii="Wingdings" w:hAnsi="Wingdings" w:hint="default"/>
+        <w:sz w:val="20"/>
+      </w:rPr>
+    </w:lvl>
+  </w:abstractNum>
   <w:num w:numId="1" w16cid:durableId="1343124811">
     <w:abstractNumId w:val="0"/>
+  </w:num>
+  <w:num w:numId="2" w16cid:durableId="1270359402">
+    <w:abstractNumId w:val="1"/>
   </w:num>
 </w:numbering>
 </file>
@@ -7935,6 +8622,27 @@
     <w:name w:val="Normal"/>
     <w:qFormat/>
   </w:style>
+  <w:style w:type="paragraph" w:styleId="Ttulo1">
+    <w:name w:val="heading 1"/>
+    <w:basedOn w:val="Normal"/>
+    <w:next w:val="Normal"/>
+    <w:link w:val="Ttulo1Car"/>
+    <w:uiPriority w:val="9"/>
+    <w:qFormat/>
+    <w:rsid w:val="00291E4E"/>
+    <w:pPr>
+      <w:keepNext/>
+      <w:keepLines/>
+      <w:spacing w:before="240" w:after="0"/>
+      <w:outlineLvl w:val="0"/>
+    </w:pPr>
+    <w:rPr>
+      <w:rFonts w:asciiTheme="majorHAnsi" w:eastAsiaTheme="majorEastAsia" w:hAnsiTheme="majorHAnsi" w:cstheme="majorBidi"/>
+      <w:color w:val="2F5496" w:themeColor="accent1" w:themeShade="BF"/>
+      <w:sz w:val="32"/>
+      <w:szCs w:val="32"/>
+    </w:rPr>
+  </w:style>
   <w:style w:type="paragraph" w:styleId="Ttulo2">
     <w:name w:val="heading 2"/>
     <w:basedOn w:val="Normal"/>
@@ -7953,6 +8661,52 @@
       <w:sz w:val="36"/>
       <w:szCs w:val="36"/>
       <w:lang w:eastAsia="es-MX"/>
+    </w:rPr>
+  </w:style>
+  <w:style w:type="paragraph" w:styleId="Ttulo3">
+    <w:name w:val="heading 3"/>
+    <w:basedOn w:val="Normal"/>
+    <w:next w:val="Normal"/>
+    <w:link w:val="Ttulo3Car"/>
+    <w:uiPriority w:val="9"/>
+    <w:semiHidden/>
+    <w:unhideWhenUsed/>
+    <w:qFormat/>
+    <w:rsid w:val="00291E4E"/>
+    <w:pPr>
+      <w:keepNext/>
+      <w:keepLines/>
+      <w:spacing w:before="40" w:after="0"/>
+      <w:outlineLvl w:val="2"/>
+    </w:pPr>
+    <w:rPr>
+      <w:rFonts w:asciiTheme="majorHAnsi" w:eastAsiaTheme="majorEastAsia" w:hAnsiTheme="majorHAnsi" w:cstheme="majorBidi"/>
+      <w:color w:val="1F3763" w:themeColor="accent1" w:themeShade="7F"/>
+      <w:sz w:val="24"/>
+      <w:szCs w:val="24"/>
+    </w:rPr>
+  </w:style>
+  <w:style w:type="paragraph" w:styleId="Ttulo4">
+    <w:name w:val="heading 4"/>
+    <w:basedOn w:val="Normal"/>
+    <w:next w:val="Normal"/>
+    <w:link w:val="Ttulo4Car"/>
+    <w:uiPriority w:val="9"/>
+    <w:semiHidden/>
+    <w:unhideWhenUsed/>
+    <w:qFormat/>
+    <w:rsid w:val="001E647A"/>
+    <w:pPr>
+      <w:keepNext/>
+      <w:keepLines/>
+      <w:spacing w:before="40" w:after="0"/>
+      <w:outlineLvl w:val="3"/>
+    </w:pPr>
+    <w:rPr>
+      <w:rFonts w:asciiTheme="majorHAnsi" w:eastAsiaTheme="majorEastAsia" w:hAnsiTheme="majorHAnsi" w:cstheme="majorBidi"/>
+      <w:i/>
+      <w:iCs/>
+      <w:color w:val="2F5496" w:themeColor="accent1" w:themeShade="BF"/>
     </w:rPr>
   </w:style>
   <w:style w:type="character" w:default="1" w:styleId="Fuentedeprrafopredeter">
@@ -8137,6 +8891,152 @@
       <w:b/>
       <w:bCs/>
     </w:rPr>
+  </w:style>
+  <w:style w:type="character" w:customStyle="1" w:styleId="Ttulo4Car">
+    <w:name w:val="Título 4 Car"/>
+    <w:basedOn w:val="Fuentedeprrafopredeter"/>
+    <w:link w:val="Ttulo4"/>
+    <w:uiPriority w:val="9"/>
+    <w:semiHidden/>
+    <w:rsid w:val="001E647A"/>
+    <w:rPr>
+      <w:rFonts w:asciiTheme="majorHAnsi" w:eastAsiaTheme="majorEastAsia" w:hAnsiTheme="majorHAnsi" w:cstheme="majorBidi"/>
+      <w:i/>
+      <w:iCs/>
+      <w:color w:val="2F5496" w:themeColor="accent1" w:themeShade="BF"/>
+    </w:rPr>
+  </w:style>
+  <w:style w:type="paragraph" w:styleId="HTMLconformatoprevio">
+    <w:name w:val="HTML Preformatted"/>
+    <w:basedOn w:val="Normal"/>
+    <w:link w:val="HTMLconformatoprevioCar"/>
+    <w:uiPriority w:val="99"/>
+    <w:unhideWhenUsed/>
+    <w:rsid w:val="009D4C05"/>
+    <w:pPr>
+      <w:tabs>
+        <w:tab w:val="left" w:pos="916"/>
+        <w:tab w:val="left" w:pos="1832"/>
+        <w:tab w:val="left" w:pos="2748"/>
+        <w:tab w:val="left" w:pos="3664"/>
+        <w:tab w:val="left" w:pos="4580"/>
+        <w:tab w:val="left" w:pos="5496"/>
+        <w:tab w:val="left" w:pos="6412"/>
+        <w:tab w:val="left" w:pos="7328"/>
+        <w:tab w:val="left" w:pos="8244"/>
+        <w:tab w:val="left" w:pos="9160"/>
+        <w:tab w:val="left" w:pos="10076"/>
+        <w:tab w:val="left" w:pos="10992"/>
+        <w:tab w:val="left" w:pos="11908"/>
+        <w:tab w:val="left" w:pos="12824"/>
+        <w:tab w:val="left" w:pos="13740"/>
+        <w:tab w:val="left" w:pos="14656"/>
+      </w:tabs>
+      <w:spacing w:after="0" w:line="240" w:lineRule="auto"/>
+    </w:pPr>
+    <w:rPr>
+      <w:rFonts w:ascii="Courier New" w:eastAsia="Times New Roman" w:hAnsi="Courier New" w:cs="Courier New"/>
+      <w:sz w:val="20"/>
+      <w:szCs w:val="20"/>
+      <w:lang w:eastAsia="es-MX"/>
+    </w:rPr>
+  </w:style>
+  <w:style w:type="character" w:customStyle="1" w:styleId="HTMLconformatoprevioCar">
+    <w:name w:val="HTML con formato previo Car"/>
+    <w:basedOn w:val="Fuentedeprrafopredeter"/>
+    <w:link w:val="HTMLconformatoprevio"/>
+    <w:uiPriority w:val="99"/>
+    <w:rsid w:val="009D4C05"/>
+    <w:rPr>
+      <w:rFonts w:ascii="Courier New" w:eastAsia="Times New Roman" w:hAnsi="Courier New" w:cs="Courier New"/>
+      <w:sz w:val="20"/>
+      <w:szCs w:val="20"/>
+      <w:lang w:eastAsia="es-MX"/>
+    </w:rPr>
+  </w:style>
+  <w:style w:type="character" w:styleId="CdigoHTML">
+    <w:name w:val="HTML Code"/>
+    <w:basedOn w:val="Fuentedeprrafopredeter"/>
+    <w:uiPriority w:val="99"/>
+    <w:semiHidden/>
+    <w:unhideWhenUsed/>
+    <w:rsid w:val="009D4C05"/>
+    <w:rPr>
+      <w:rFonts w:ascii="Courier New" w:eastAsia="Times New Roman" w:hAnsi="Courier New" w:cs="Courier New"/>
+      <w:sz w:val="20"/>
+      <w:szCs w:val="20"/>
+    </w:rPr>
+  </w:style>
+  <w:style w:type="character" w:customStyle="1" w:styleId="Ttulo1Car">
+    <w:name w:val="Título 1 Car"/>
+    <w:basedOn w:val="Fuentedeprrafopredeter"/>
+    <w:link w:val="Ttulo1"/>
+    <w:uiPriority w:val="9"/>
+    <w:rsid w:val="00291E4E"/>
+    <w:rPr>
+      <w:rFonts w:asciiTheme="majorHAnsi" w:eastAsiaTheme="majorEastAsia" w:hAnsiTheme="majorHAnsi" w:cstheme="majorBidi"/>
+      <w:color w:val="2F5496" w:themeColor="accent1" w:themeShade="BF"/>
+      <w:sz w:val="32"/>
+      <w:szCs w:val="32"/>
+    </w:rPr>
+  </w:style>
+  <w:style w:type="character" w:customStyle="1" w:styleId="Ttulo3Car">
+    <w:name w:val="Título 3 Car"/>
+    <w:basedOn w:val="Fuentedeprrafopredeter"/>
+    <w:link w:val="Ttulo3"/>
+    <w:uiPriority w:val="9"/>
+    <w:semiHidden/>
+    <w:rsid w:val="00291E4E"/>
+    <w:rPr>
+      <w:rFonts w:asciiTheme="majorHAnsi" w:eastAsiaTheme="majorEastAsia" w:hAnsiTheme="majorHAnsi" w:cstheme="majorBidi"/>
+      <w:color w:val="1F3763" w:themeColor="accent1" w:themeShade="7F"/>
+      <w:sz w:val="24"/>
+      <w:szCs w:val="24"/>
+    </w:rPr>
+  </w:style>
+  <w:style w:type="paragraph" w:styleId="Encabezado">
+    <w:name w:val="header"/>
+    <w:basedOn w:val="Normal"/>
+    <w:link w:val="EncabezadoCar"/>
+    <w:uiPriority w:val="99"/>
+    <w:unhideWhenUsed/>
+    <w:rsid w:val="00291E4E"/>
+    <w:pPr>
+      <w:tabs>
+        <w:tab w:val="center" w:pos="4419"/>
+        <w:tab w:val="right" w:pos="8838"/>
+      </w:tabs>
+      <w:spacing w:after="0" w:line="240" w:lineRule="auto"/>
+    </w:pPr>
+  </w:style>
+  <w:style w:type="character" w:customStyle="1" w:styleId="EncabezadoCar">
+    <w:name w:val="Encabezado Car"/>
+    <w:basedOn w:val="Fuentedeprrafopredeter"/>
+    <w:link w:val="Encabezado"/>
+    <w:uiPriority w:val="99"/>
+    <w:rsid w:val="00291E4E"/>
+  </w:style>
+  <w:style w:type="paragraph" w:styleId="Piedepgina">
+    <w:name w:val="footer"/>
+    <w:basedOn w:val="Normal"/>
+    <w:link w:val="PiedepginaCar"/>
+    <w:uiPriority w:val="99"/>
+    <w:unhideWhenUsed/>
+    <w:rsid w:val="00291E4E"/>
+    <w:pPr>
+      <w:tabs>
+        <w:tab w:val="center" w:pos="4419"/>
+        <w:tab w:val="right" w:pos="8838"/>
+      </w:tabs>
+      <w:spacing w:after="0" w:line="240" w:lineRule="auto"/>
+    </w:pPr>
+  </w:style>
+  <w:style w:type="character" w:customStyle="1" w:styleId="PiedepginaCar">
+    <w:name w:val="Pie de página Car"/>
+    <w:basedOn w:val="Fuentedeprrafopredeter"/>
+    <w:link w:val="Piedepgina"/>
+    <w:uiPriority w:val="99"/>
+    <w:rsid w:val="00291E4E"/>
   </w:style>
 </w:styles>
 </file>

</xml_diff>

<commit_message>
feat: agregar archivos faltantes para entrega final
</commit_message>
<xml_diff>
--- a/Practica1/Informe de Desarrollo.docx
+++ b/Practica1/Informe de Desarrollo.docx
@@ -3,11 +3,346 @@
 <w:document xmlns:wpc="http://schemas.microsoft.com/office/word/2010/wordprocessingCanvas" xmlns:cx="http://schemas.microsoft.com/office/drawing/2014/chartex" xmlns:cx1="http://schemas.microsoft.com/office/drawing/2015/9/8/chartex" xmlns:cx2="http://schemas.microsoft.com/office/drawing/2015/10/21/chartex" xmlns:cx3="http://schemas.microsoft.com/office/drawing/2016/5/9/chartex" xmlns:cx4="http://schemas.microsoft.com/office/drawing/2016/5/10/chartex" xmlns:cx5="http://schemas.microsoft.com/office/drawing/2016/5/11/chartex" xmlns:cx6="http://schemas.microsoft.com/office/drawing/2016/5/12/chartex" xmlns:cx7="http://schemas.microsoft.com/office/drawing/2016/5/13/chartex" xmlns:cx8="http://schemas.microsoft.com/office/drawing/2016/5/14/chartex" xmlns:mc="http://schemas.openxmlformats.org/markup-compatibility/2006" xmlns:aink="http://schemas.microsoft.com/office/drawing/2016/ink" xmlns:am3d="http://schemas.microsoft.com/office/drawing/2017/model3d" xmlns:o="urn:schemas-microsoft-com:office:office" xmlns:oel="http://schemas.microsoft.com/office/2019/extlst" xmlns:r="http://schemas.openxmlformats.org/officeDocument/2006/relationships" xmlns:m="http://schemas.openxmlformats.org/officeDocument/2006/math" xmlns:v="urn:schemas-microsoft-com:vml" xmlns:wp14="http://schemas.microsoft.com/office/word/2010/wordprocessingDrawing" xmlns:wp="http://schemas.openxmlformats.org/drawingml/2006/wordprocessingDrawing" xmlns:w10="urn:schemas-microsoft-com:office:word" xmlns:w="http://schemas.openxmlformats.org/wordprocessingml/2006/main" xmlns:w14="http://schemas.microsoft.com/office/word/2010/wordml" xmlns:w15="http://schemas.microsoft.com/office/word/2012/wordml" xmlns:w16cex="http://schemas.microsoft.com/office/word/2018/wordml/cex" xmlns:w16cid="http://schemas.microsoft.com/office/word/2016/wordml/cid" xmlns:w16="http://schemas.microsoft.com/office/word/2018/wordml" xmlns:w16sdtdh="http://schemas.microsoft.com/office/word/2020/wordml/sdtdatahash" xmlns:w16se="http://schemas.microsoft.com/office/word/2015/wordml/symex" xmlns:wpg="http://schemas.microsoft.com/office/word/2010/wordprocessingGroup" xmlns:wpi="http://schemas.microsoft.com/office/word/2010/wordprocessingInk" xmlns:wne="http://schemas.microsoft.com/office/word/2006/wordml" xmlns:wps="http://schemas.microsoft.com/office/word/2010/wordprocessingShape" mc:Ignorable="w14 w15 w16se w16cid w16 w16cex w16sdtdh wp14">
   <w:body>
     <w:p>
-      <w:r>
+      <w:pPr>
+        <w:spacing w:after="400"/>
+        <w:jc w:val="center"/>
         <w:rPr>
           <w:b/>
           <w:bCs/>
-        </w:rPr>
+          <w:sz w:val="24"/>
+          <w:szCs w:val="24"/>
+        </w:rPr>
+      </w:pPr>
+    </w:p>
+    <w:p>
+      <w:pPr>
+        <w:spacing w:after="400"/>
+        <w:jc w:val="center"/>
+        <w:rPr>
+          <w:b/>
+          <w:bCs/>
+          <w:sz w:val="24"/>
+          <w:szCs w:val="24"/>
+        </w:rPr>
+      </w:pPr>
+    </w:p>
+    <w:p>
+      <w:pPr>
+        <w:spacing w:after="400"/>
+        <w:jc w:val="center"/>
+        <w:rPr>
+          <w:b/>
+          <w:bCs/>
+          <w:sz w:val="24"/>
+          <w:szCs w:val="24"/>
+        </w:rPr>
+      </w:pPr>
+      <w:r>
+        <w:rPr>
+          <w:b/>
+          <w:bCs/>
+          <w:noProof/>
+          <w:sz w:val="24"/>
+          <w:szCs w:val="24"/>
+        </w:rPr>
+        <w:drawing>
+          <wp:anchor distT="0" distB="0" distL="114300" distR="114300" simplePos="0" relativeHeight="251659264" behindDoc="0" locked="0" layoutInCell="1" allowOverlap="1" wp14:anchorId="231E8245" wp14:editId="17CD49E0">
+            <wp:simplePos x="0" y="0"/>
+            <wp:positionH relativeFrom="margin">
+              <wp:align>center</wp:align>
+            </wp:positionH>
+            <wp:positionV relativeFrom="paragraph">
+              <wp:posOffset>595864</wp:posOffset>
+            </wp:positionV>
+            <wp:extent cx="4995682" cy="1219202"/>
+            <wp:effectExtent l="0" t="0" r="0" b="0"/>
+            <wp:wrapSquare wrapText="bothSides"/>
+            <wp:docPr id="2" name="Imagen 2"/>
+            <wp:cNvGraphicFramePr>
+              <a:graphicFrameLocks xmlns:a="http://schemas.openxmlformats.org/drawingml/2006/main" noChangeAspect="1"/>
+            </wp:cNvGraphicFramePr>
+            <a:graphic xmlns:a="http://schemas.openxmlformats.org/drawingml/2006/main">
+              <a:graphicData uri="http://schemas.openxmlformats.org/drawingml/2006/picture">
+                <pic:pic xmlns:pic="http://schemas.openxmlformats.org/drawingml/2006/picture">
+                  <pic:nvPicPr>
+                    <pic:cNvPr id="2" name="Imagen 2"/>
+                    <pic:cNvPicPr/>
+                  </pic:nvPicPr>
+                  <pic:blipFill>
+                    <a:blip r:embed="rId7" cstate="print">
+                      <a:extLst>
+                        <a:ext uri="{28A0092B-C50C-407E-A947-70E740481C1C}">
+                          <a14:useLocalDpi xmlns:a14="http://schemas.microsoft.com/office/drawing/2010/main" val="0"/>
+                        </a:ext>
+                      </a:extLst>
+                    </a:blip>
+                    <a:stretch>
+                      <a:fillRect/>
+                    </a:stretch>
+                  </pic:blipFill>
+                  <pic:spPr>
+                    <a:xfrm>
+                      <a:off x="0" y="0"/>
+                      <a:ext cx="4995682" cy="1219202"/>
+                    </a:xfrm>
+                    <a:prstGeom prst="rect">
+                      <a:avLst/>
+                    </a:prstGeom>
+                  </pic:spPr>
+                </pic:pic>
+              </a:graphicData>
+            </a:graphic>
+            <wp14:sizeRelH relativeFrom="page">
+              <wp14:pctWidth>0</wp14:pctWidth>
+            </wp14:sizeRelH>
+            <wp14:sizeRelV relativeFrom="page">
+              <wp14:pctHeight>0</wp14:pctHeight>
+            </wp14:sizeRelV>
+          </wp:anchor>
+        </w:drawing>
+      </w:r>
+    </w:p>
+    <w:p>
+      <w:pPr>
+        <w:spacing w:after="400"/>
+        <w:jc w:val="center"/>
+        <w:rPr>
+          <w:b/>
+          <w:bCs/>
+          <w:sz w:val="24"/>
+          <w:szCs w:val="24"/>
+        </w:rPr>
+      </w:pPr>
+    </w:p>
+    <w:p>
+      <w:pPr>
+        <w:spacing w:after="400"/>
+        <w:jc w:val="center"/>
+      </w:pPr>
+      <w:r>
+        <w:rPr>
+          <w:b/>
+          <w:bCs/>
+          <w:sz w:val="24"/>
+          <w:szCs w:val="24"/>
+        </w:rPr>
+        <w:t>Universidad de San Carlos de Guatemala</w:t>
+      </w:r>
+    </w:p>
+    <w:p>
+      <w:pPr>
+        <w:spacing w:after="40"/>
+        <w:jc w:val="center"/>
+      </w:pPr>
+      <w:r>
+        <w:t>Facultad de Ingeniería</w:t>
+      </w:r>
+    </w:p>
+    <w:p>
+      <w:pPr>
+        <w:spacing w:after="40"/>
+        <w:jc w:val="center"/>
+      </w:pPr>
+      <w:r>
+        <w:t>Escuela de Ciencias y Sistemas</w:t>
+      </w:r>
+    </w:p>
+    <w:p>
+      <w:pPr>
+        <w:spacing w:after="400"/>
+        <w:jc w:val="center"/>
+      </w:pPr>
+      <w:r>
+        <w:t>Laboratorio de Redes de Computadoras 1</w:t>
+      </w:r>
+    </w:p>
+    <w:p>
+      <w:pPr>
+        <w:spacing w:before="400" w:after="200"/>
+        <w:jc w:val="center"/>
+        <w:rPr>
+          <w:color w:val="000000" w:themeColor="text1"/>
+        </w:rPr>
+      </w:pPr>
+      <w:r>
+        <w:rPr>
+          <w:b/>
+          <w:bCs/>
+          <w:color w:val="000000" w:themeColor="text1"/>
+          <w:sz w:val="36"/>
+          <w:szCs w:val="36"/>
+          <w:highlight w:val="yellow"/>
+        </w:rPr>
+        <w:t>Informe de Desarrollo</w:t>
+      </w:r>
+    </w:p>
+    <w:p>
+      <w:pPr>
+        <w:spacing w:after="600"/>
+        <w:jc w:val="center"/>
+      </w:pPr>
+      <w:r>
+        <w:rPr>
+          <w:i/>
+          <w:iCs/>
+          <w:sz w:val="26"/>
+          <w:szCs w:val="26"/>
+        </w:rPr>
+        <w:t xml:space="preserve">Práctica 1 — </w:t>
+      </w:r>
+      <w:proofErr w:type="spellStart"/>
+      <w:r>
+        <w:rPr>
+          <w:i/>
+          <w:iCs/>
+          <w:sz w:val="26"/>
+          <w:szCs w:val="26"/>
+        </w:rPr>
+        <w:t>QuetzalDev</w:t>
+      </w:r>
+      <w:proofErr w:type="spellEnd"/>
+      <w:r>
+        <w:rPr>
+          <w:i/>
+          <w:iCs/>
+          <w:sz w:val="26"/>
+          <w:szCs w:val="26"/>
+        </w:rPr>
+        <w:t xml:space="preserve"> S.A.</w:t>
+      </w:r>
+    </w:p>
+    <w:p>
+      <w:pPr>
+        <w:spacing w:after="80"/>
+      </w:pPr>
+      <w:r>
+        <w:rPr>
+          <w:b/>
+          <w:bCs/>
+        </w:rPr>
+        <w:t>Nombre: Mayelin Lucía Quevedo Camey</w:t>
+      </w:r>
+    </w:p>
+    <w:p>
+      <w:pPr>
+        <w:spacing w:after="80"/>
+      </w:pPr>
+      <w:r>
+        <w:rPr>
+          <w:b/>
+          <w:bCs/>
+        </w:rPr>
+        <w:t>Carnet: 2023007771</w:t>
+      </w:r>
+    </w:p>
+    <w:p>
+      <w:pPr>
+        <w:spacing w:after="80"/>
+        <w:jc w:val="center"/>
+      </w:pPr>
+      <w:r>
+        <w:rPr>
+          <w:b/>
+          <w:bCs/>
+        </w:rPr>
+        <w:t>Fecha: 22 de agosto de 2026</w:t>
+      </w:r>
+    </w:p>
+    <w:p>
+      <w:pPr>
+        <w:rPr>
+          <w:b/>
+          <w:bCs/>
+        </w:rPr>
+      </w:pPr>
+    </w:p>
+    <w:p>
+      <w:pPr>
+        <w:rPr>
+          <w:b/>
+          <w:bCs/>
+        </w:rPr>
+      </w:pPr>
+    </w:p>
+    <w:p>
+      <w:pPr>
+        <w:rPr>
+          <w:b/>
+          <w:bCs/>
+        </w:rPr>
+      </w:pPr>
+    </w:p>
+    <w:p>
+      <w:pPr>
+        <w:rPr>
+          <w:b/>
+          <w:bCs/>
+        </w:rPr>
+      </w:pPr>
+    </w:p>
+    <w:p>
+      <w:pPr>
+        <w:rPr>
+          <w:b/>
+          <w:bCs/>
+        </w:rPr>
+      </w:pPr>
+    </w:p>
+    <w:p>
+      <w:pPr>
+        <w:rPr>
+          <w:b/>
+          <w:bCs/>
+        </w:rPr>
+      </w:pPr>
+    </w:p>
+    <w:p>
+      <w:pPr>
+        <w:rPr>
+          <w:b/>
+          <w:bCs/>
+        </w:rPr>
+      </w:pPr>
+    </w:p>
+    <w:p>
+      <w:pPr>
+        <w:rPr>
+          <w:b/>
+          <w:bCs/>
+        </w:rPr>
+      </w:pPr>
+    </w:p>
+    <w:p>
+      <w:pPr>
+        <w:rPr>
+          <w:b/>
+          <w:bCs/>
+        </w:rPr>
+      </w:pPr>
+    </w:p>
+    <w:p>
+      <w:pPr>
+        <w:rPr>
+          <w:b/>
+          <w:bCs/>
+        </w:rPr>
+      </w:pPr>
+    </w:p>
+    <w:p>
+      <w:pPr>
+        <w:rPr>
+          <w:b/>
+          <w:bCs/>
+        </w:rPr>
+      </w:pPr>
+    </w:p>
+    <w:p>
+      <w:r>
+        <w:rPr>
+          <w:b/>
+          <w:bCs/>
+        </w:rPr>
+        <w:lastRenderedPageBreak/>
         <w:t>1. Distribución PCs y Laptop</w:t>
       </w:r>
     </w:p>
@@ -54,7 +389,13 @@
         <w:t>o</w:t>
       </w:r>
       <w:r>
-        <w:t xml:space="preserve">, lo único que se decidió fue cuántas de esas máquinas son de escritorio </w:t>
+        <w:t xml:space="preserve">, lo único que </w:t>
+      </w:r>
+      <w:r>
+        <w:t>decidí por mi cuenta</w:t>
+      </w:r>
+      <w:r>
+        <w:t xml:space="preserve"> fue cuántas de esas máquinas son de escritorio </w:t>
       </w:r>
       <w:r>
         <w:t>y cuántas son</w:t>
@@ -3568,6 +3909,7 @@
           <w:szCs w:val="21"/>
           <w:shd w:val="clear" w:color="auto" w:fill="FFFFFF"/>
         </w:rPr>
+        <w:lastRenderedPageBreak/>
         <w:t>2. Elegir Topología Física por Departamento</w:t>
       </w:r>
     </w:p>
@@ -3584,14 +3926,108 @@
       <w:r>
         <w:rPr>
           <w:rFonts w:cstheme="minorHAnsi"/>
+          <w:i/>
+          <w:iCs/>
           <w:color w:val="000000" w:themeColor="text1"/>
           <w:sz w:val="21"/>
           <w:szCs w:val="21"/>
           <w:shd w:val="clear" w:color="auto" w:fill="FFFFFF"/>
         </w:rPr>
-        <w:t xml:space="preserve">El enunciado de la práctica menciona que cada departamento tiene solo un switch al que se conectan todos sus respectivos hosts, esto me llevó a la conclusión de que la topología más adecuada siempre será </w:t>
-      </w:r>
-      <w:r>
+        <w:t>.</w:t>
+      </w:r>
+    </w:p>
+    <w:p>
+      <w:pPr>
+        <w:spacing w:after="200" w:line="300" w:lineRule="auto"/>
+      </w:pPr>
+      <w:r>
+        <w:t>Al analizar el enunciado, noté que cada departamento tiene un único switch al que se conectan todos sus host</w:t>
+      </w:r>
+      <w:r>
+        <w:t>s.</w:t>
+      </w:r>
+      <w:r>
+        <w:br/>
+      </w:r>
+      <w:r>
+        <w:t xml:space="preserve"> </w:t>
+      </w:r>
+      <w:r>
+        <w:t xml:space="preserve">Entonces </w:t>
+      </w:r>
+      <w:r>
+        <w:t xml:space="preserve">la topología de cada </w:t>
+      </w:r>
+      <w:r>
+        <w:t>departamento s</w:t>
+      </w:r>
+      <w:r>
+        <w:t>iempre</w:t>
+      </w:r>
+      <w:r>
+        <w:t xml:space="preserve"> </w:t>
+      </w:r>
+      <w:proofErr w:type="gramStart"/>
+      <w:r>
+        <w:t xml:space="preserve">sería </w:t>
+      </w:r>
+      <w:r>
+        <w:t xml:space="preserve"> estrella</w:t>
+      </w:r>
+      <w:proofErr w:type="gramEnd"/>
+      <w:r>
+        <w:t>.</w:t>
+      </w:r>
+    </w:p>
+    <w:p>
+      <w:pPr>
+        <w:pStyle w:val="Sinespaciado"/>
+      </w:pPr>
+      <w:r>
+        <w:rPr>
+          <w:rStyle w:val="Textoennegrita"/>
+        </w:rPr>
+        <w:t xml:space="preserve">Y para la red completa del edificio: </w:t>
+      </w:r>
+      <w:r>
+        <w:t xml:space="preserve">es una </w:t>
+      </w:r>
+      <w:r>
+        <w:rPr>
+          <w:rStyle w:val="Textoennegrita"/>
+        </w:rPr>
+        <w:t>topología de árbol / estrella extendida</w:t>
+      </w:r>
+      <w:r>
+        <w:t>,</w:t>
+      </w:r>
+      <w:r>
+        <w:br/>
+        <w:t>con el MDF como raíz y cada switch de departamento como rama.</w:t>
+      </w:r>
+      <w:r>
+        <w:br/>
+        <w:t xml:space="preserve"> </w:t>
+      </w:r>
+      <w:r>
+        <w:br/>
+        <w:t xml:space="preserve">Esta es la que le da al edificio escalabilidad y aislamiento de fallas entre departamentos, </w:t>
+      </w:r>
+      <w:r>
+        <w:br/>
+        <w:t>es decir, si por ejemplo departamento Legal se cae, el departamento de Recursos Humanos sigue funcionando normal.</w:t>
+      </w:r>
+    </w:p>
+    <w:p>
+      <w:pPr>
+        <w:pStyle w:val="Sinespaciado"/>
+      </w:pPr>
+      <w:r>
+        <w:t>Descarte la topología malla porque en este contexto (LAN de oficina pequeña, sin redundancia crítica exigida) el costo de cablear cada nodo con todos los demás no es una buena práctica.</w:t>
+      </w:r>
+    </w:p>
+    <w:p>
+      <w:pPr>
         <w:rPr>
           <w:rFonts w:cstheme="minorHAnsi"/>
           <w:b/>
@@ -3601,1402 +4037,75 @@
           <w:szCs w:val="21"/>
           <w:shd w:val="clear" w:color="auto" w:fill="FFFFFF"/>
         </w:rPr>
-        <w:t>topología de estrella</w:t>
-      </w:r>
+      </w:pPr>
       <w:r>
         <w:rPr>
           <w:rFonts w:cstheme="minorHAnsi"/>
+          <w:b/>
+          <w:bCs/>
+          <w:noProof/>
           <w:color w:val="000000" w:themeColor="text1"/>
           <w:sz w:val="21"/>
           <w:szCs w:val="21"/>
           <w:shd w:val="clear" w:color="auto" w:fill="FFFFFF"/>
         </w:rPr>
-        <w:t xml:space="preserve">, </w:t>
-      </w:r>
-      <w:r>
-        <w:rPr>
-          <w:rFonts w:cstheme="minorHAnsi"/>
-          <w:i/>
-          <w:iCs/>
-          <w:color w:val="000000" w:themeColor="text1"/>
-          <w:sz w:val="21"/>
-          <w:szCs w:val="21"/>
-          <w:shd w:val="clear" w:color="auto" w:fill="FFFFFF"/>
-        </w:rPr>
-        <w:t>para todos los departamentos.</w:t>
-      </w:r>
-    </w:p>
-    <w:tbl>
-      <w:tblPr>
-        <w:tblStyle w:val="Tablaconcuadrcula"/>
-        <w:tblpPr w:leftFromText="141" w:rightFromText="141" w:vertAnchor="page" w:horzAnchor="margin" w:tblpXSpec="center" w:tblpY="3011"/>
-        <w:tblW w:w="9976" w:type="dxa"/>
-        <w:tblLook w:val="04A0" w:firstRow="1" w:lastRow="0" w:firstColumn="1" w:lastColumn="0" w:noHBand="0" w:noVBand="1"/>
-      </w:tblPr>
-      <w:tblGrid>
-        <w:gridCol w:w="1550"/>
-        <w:gridCol w:w="1139"/>
-        <w:gridCol w:w="1997"/>
-        <w:gridCol w:w="1309"/>
-        <w:gridCol w:w="3981"/>
-      </w:tblGrid>
-      <w:tr>
-        <w:trPr>
-          <w:trHeight w:val="262"/>
-        </w:trPr>
-        <w:tc>
-          <w:tcPr>
-            <w:tcW w:w="1550" w:type="dxa"/>
-          </w:tcPr>
-          <w:p>
-            <w:pPr>
-              <w:rPr>
-                <w:rFonts w:cstheme="minorHAnsi"/>
-                <w:b/>
-                <w:bCs/>
-                <w:color w:val="000000" w:themeColor="text1"/>
-                <w:sz w:val="21"/>
-                <w:szCs w:val="21"/>
-                <w:shd w:val="clear" w:color="auto" w:fill="FFFFFF"/>
-              </w:rPr>
-            </w:pPr>
-            <w:r>
-              <w:rPr>
-                <w:rFonts w:cstheme="minorHAnsi"/>
-                <w:b/>
-                <w:bCs/>
-                <w:color w:val="000000" w:themeColor="text1"/>
-                <w:sz w:val="21"/>
-                <w:szCs w:val="21"/>
-                <w:shd w:val="clear" w:color="auto" w:fill="FFFFFF"/>
-              </w:rPr>
-              <w:t xml:space="preserve">Departamento </w:t>
-            </w:r>
-          </w:p>
-        </w:tc>
-        <w:tc>
-          <w:tcPr>
-            <w:tcW w:w="1139" w:type="dxa"/>
-          </w:tcPr>
-          <w:p>
-            <w:pPr>
-              <w:rPr>
-                <w:rFonts w:cstheme="minorHAnsi"/>
-                <w:b/>
-                <w:bCs/>
-                <w:color w:val="000000" w:themeColor="text1"/>
-                <w:sz w:val="21"/>
-                <w:szCs w:val="21"/>
-                <w:shd w:val="clear" w:color="auto" w:fill="FFFFFF"/>
-              </w:rPr>
-            </w:pPr>
-            <w:r>
-              <w:rPr>
-                <w:rFonts w:cstheme="minorHAnsi"/>
-                <w:b/>
-                <w:bCs/>
-                <w:color w:val="000000" w:themeColor="text1"/>
-                <w:sz w:val="21"/>
-                <w:szCs w:val="21"/>
-                <w:shd w:val="clear" w:color="auto" w:fill="FFFFFF"/>
-              </w:rPr>
-              <w:t>Hosts</w:t>
-            </w:r>
-          </w:p>
-        </w:tc>
-        <w:tc>
-          <w:tcPr>
-            <w:tcW w:w="1997" w:type="dxa"/>
-          </w:tcPr>
-          <w:p>
-            <w:pPr>
-              <w:rPr>
-                <w:rFonts w:cstheme="minorHAnsi"/>
-                <w:b/>
-                <w:bCs/>
-                <w:color w:val="000000" w:themeColor="text1"/>
-                <w:sz w:val="21"/>
-                <w:szCs w:val="21"/>
-                <w:shd w:val="clear" w:color="auto" w:fill="FFFFFF"/>
-              </w:rPr>
-            </w:pPr>
-            <w:r>
-              <w:rPr>
-                <w:rFonts w:cstheme="minorHAnsi"/>
-                <w:b/>
-                <w:bCs/>
-                <w:color w:val="000000" w:themeColor="text1"/>
-                <w:sz w:val="21"/>
-                <w:szCs w:val="21"/>
-                <w:shd w:val="clear" w:color="auto" w:fill="FFFFFF"/>
-              </w:rPr>
-              <w:t>Actividad</w:t>
-            </w:r>
-          </w:p>
-        </w:tc>
-        <w:tc>
-          <w:tcPr>
-            <w:tcW w:w="1309" w:type="dxa"/>
-          </w:tcPr>
-          <w:p>
-            <w:pPr>
-              <w:rPr>
-                <w:rFonts w:cstheme="minorHAnsi"/>
-                <w:b/>
-                <w:bCs/>
-                <w:color w:val="000000" w:themeColor="text1"/>
-                <w:sz w:val="21"/>
-                <w:szCs w:val="21"/>
-                <w:shd w:val="clear" w:color="auto" w:fill="FFFFFF"/>
-              </w:rPr>
-            </w:pPr>
-            <w:r>
-              <w:rPr>
-                <w:rFonts w:cstheme="minorHAnsi"/>
-                <w:b/>
-                <w:bCs/>
-                <w:color w:val="000000" w:themeColor="text1"/>
-                <w:sz w:val="21"/>
-                <w:szCs w:val="21"/>
-                <w:shd w:val="clear" w:color="auto" w:fill="FFFFFF"/>
-              </w:rPr>
-              <w:t xml:space="preserve">TOPOLOGIA </w:t>
-            </w:r>
-          </w:p>
-        </w:tc>
-        <w:tc>
-          <w:tcPr>
-            <w:tcW w:w="3981" w:type="dxa"/>
-          </w:tcPr>
-          <w:p>
-            <w:pPr>
-              <w:rPr>
-                <w:rFonts w:cstheme="minorHAnsi"/>
-                <w:b/>
-                <w:bCs/>
-                <w:color w:val="000000" w:themeColor="text1"/>
-                <w:sz w:val="21"/>
-                <w:szCs w:val="21"/>
-                <w:shd w:val="clear" w:color="auto" w:fill="FFFFFF"/>
-              </w:rPr>
-            </w:pPr>
-            <w:r>
-              <w:rPr>
-                <w:rFonts w:cstheme="minorHAnsi"/>
-                <w:b/>
-                <w:bCs/>
-                <w:color w:val="000000" w:themeColor="text1"/>
-                <w:sz w:val="21"/>
-                <w:szCs w:val="21"/>
-                <w:shd w:val="clear" w:color="auto" w:fill="FFFFFF"/>
-              </w:rPr>
-              <w:t>Justificación</w:t>
-            </w:r>
-          </w:p>
-        </w:tc>
-      </w:tr>
-      <w:tr>
-        <w:trPr>
-          <w:trHeight w:val="849"/>
-        </w:trPr>
-        <w:tc>
-          <w:tcPr>
-            <w:tcW w:w="1550" w:type="dxa"/>
-          </w:tcPr>
-          <w:p>
-            <w:pPr>
-              <w:rPr>
-                <w:rFonts w:cstheme="minorHAnsi"/>
-                <w:b/>
-                <w:bCs/>
-                <w:color w:val="000000" w:themeColor="text1"/>
-                <w:sz w:val="21"/>
-                <w:szCs w:val="21"/>
-                <w:shd w:val="clear" w:color="auto" w:fill="FFFFFF"/>
-              </w:rPr>
-            </w:pPr>
-          </w:p>
-          <w:p>
-            <w:pPr>
-              <w:rPr>
-                <w:rFonts w:cstheme="minorHAnsi"/>
-                <w:b/>
-                <w:bCs/>
-                <w:color w:val="000000" w:themeColor="text1"/>
-                <w:sz w:val="21"/>
-                <w:szCs w:val="21"/>
-                <w:shd w:val="clear" w:color="auto" w:fill="FFFFFF"/>
-              </w:rPr>
-            </w:pPr>
-          </w:p>
-          <w:p>
-            <w:pPr>
-              <w:rPr>
-                <w:rFonts w:cstheme="minorHAnsi"/>
-                <w:b/>
-                <w:bCs/>
-                <w:color w:val="000000" w:themeColor="text1"/>
-                <w:sz w:val="21"/>
-                <w:szCs w:val="21"/>
-                <w:shd w:val="clear" w:color="auto" w:fill="FFFFFF"/>
-              </w:rPr>
-            </w:pPr>
-            <w:r>
-              <w:rPr>
-                <w:rFonts w:cstheme="minorHAnsi"/>
-                <w:b/>
-                <w:bCs/>
-                <w:color w:val="000000" w:themeColor="text1"/>
-                <w:sz w:val="21"/>
-                <w:szCs w:val="21"/>
-                <w:shd w:val="clear" w:color="auto" w:fill="FFFFFF"/>
-              </w:rPr>
-              <w:t>Recepción</w:t>
-            </w:r>
-          </w:p>
-        </w:tc>
-        <w:tc>
-          <w:tcPr>
-            <w:tcW w:w="1139" w:type="dxa"/>
-          </w:tcPr>
-          <w:p>
-            <w:pPr>
-              <w:rPr>
-                <w:rFonts w:cstheme="minorHAnsi"/>
-                <w:color w:val="000000" w:themeColor="text1"/>
-                <w:sz w:val="21"/>
-                <w:szCs w:val="21"/>
-                <w:shd w:val="clear" w:color="auto" w:fill="FFFFFF"/>
-              </w:rPr>
-            </w:pPr>
-            <w:r>
-              <w:rPr>
-                <w:rFonts w:cstheme="minorHAnsi"/>
-                <w:color w:val="000000" w:themeColor="text1"/>
-                <w:sz w:val="21"/>
-                <w:szCs w:val="21"/>
-                <w:shd w:val="clear" w:color="auto" w:fill="FFFFFF"/>
-              </w:rPr>
-              <w:t>3 +</w:t>
-            </w:r>
-            <w:r>
-              <w:rPr>
-                <w:rFonts w:cstheme="minorHAnsi"/>
-                <w:color w:val="000000" w:themeColor="text1"/>
-                <w:sz w:val="21"/>
-                <w:szCs w:val="21"/>
-                <w:shd w:val="clear" w:color="auto" w:fill="FFFFFF"/>
-              </w:rPr>
-              <w:br/>
-            </w:r>
-            <w:r>
-              <w:rPr>
-                <w:rFonts w:cstheme="minorHAnsi"/>
-                <w:color w:val="000000" w:themeColor="text1"/>
-                <w:sz w:val="21"/>
-                <w:szCs w:val="21"/>
-                <w:shd w:val="clear" w:color="auto" w:fill="FFFFFF"/>
-              </w:rPr>
-              <w:t xml:space="preserve"> 1 servidor</w:t>
-            </w:r>
-          </w:p>
-        </w:tc>
-        <w:tc>
-          <w:tcPr>
-            <w:tcW w:w="1997" w:type="dxa"/>
-          </w:tcPr>
-          <w:p>
-            <w:pPr>
-              <w:rPr>
-                <w:rFonts w:cstheme="minorHAnsi"/>
-                <w:color w:val="000000" w:themeColor="text1"/>
-                <w:sz w:val="21"/>
-                <w:szCs w:val="21"/>
-                <w:shd w:val="clear" w:color="auto" w:fill="FFFFFF"/>
-              </w:rPr>
-            </w:pPr>
-            <w:r>
-              <w:t>punto de entrada, 1 servidor</w:t>
-            </w:r>
-          </w:p>
-        </w:tc>
-        <w:tc>
-          <w:tcPr>
-            <w:tcW w:w="1309" w:type="dxa"/>
-          </w:tcPr>
-          <w:p>
-            <w:pPr>
-              <w:jc w:val="center"/>
-              <w:rPr>
-                <w:rFonts w:cstheme="minorHAnsi"/>
-                <w:b/>
-                <w:bCs/>
-                <w:color w:val="000000" w:themeColor="text1"/>
-                <w:sz w:val="21"/>
-                <w:szCs w:val="21"/>
-                <w:shd w:val="clear" w:color="auto" w:fill="FFFFFF"/>
-              </w:rPr>
-            </w:pPr>
-            <w:r>
-              <w:rPr>
-                <w:rFonts w:cstheme="minorHAnsi"/>
-                <w:b/>
-                <w:bCs/>
-                <w:color w:val="000000" w:themeColor="text1"/>
-                <w:sz w:val="21"/>
-                <w:szCs w:val="21"/>
-                <w:shd w:val="clear" w:color="auto" w:fill="FFFFFF"/>
-              </w:rPr>
-              <w:t>Estrella</w:t>
-            </w:r>
-          </w:p>
-        </w:tc>
-        <w:tc>
-          <w:tcPr>
-            <w:tcW w:w="3981" w:type="dxa"/>
-          </w:tcPr>
-          <w:p>
-            <w:pPr>
-              <w:rPr>
-                <w:rFonts w:cstheme="minorHAnsi"/>
-                <w:color w:val="000000" w:themeColor="text1"/>
-                <w:sz w:val="21"/>
-                <w:szCs w:val="21"/>
-                <w:shd w:val="clear" w:color="auto" w:fill="FFFFFF"/>
-              </w:rPr>
-            </w:pPr>
-            <w:r>
-              <w:t>Pocos hosts,</w:t>
-            </w:r>
-            <w:r>
-              <w:br/>
-              <w:t>estrella es la opción más económica; suficiente para el tráfico bajo de esta área</w:t>
-            </w:r>
-          </w:p>
-        </w:tc>
-      </w:tr>
-      <w:tr>
-        <w:trPr>
-          <w:trHeight w:val="831"/>
-        </w:trPr>
-        <w:tc>
-          <w:tcPr>
-            <w:tcW w:w="1550" w:type="dxa"/>
-          </w:tcPr>
-          <w:p>
-            <w:pPr>
-              <w:rPr>
-                <w:rFonts w:cstheme="minorHAnsi"/>
-                <w:b/>
-                <w:bCs/>
-                <w:color w:val="000000" w:themeColor="text1"/>
-                <w:sz w:val="21"/>
-                <w:szCs w:val="21"/>
-                <w:shd w:val="clear" w:color="auto" w:fill="FFFFFF"/>
-              </w:rPr>
-            </w:pPr>
-          </w:p>
-          <w:p>
-            <w:pPr>
-              <w:rPr>
-                <w:rFonts w:cstheme="minorHAnsi"/>
-                <w:b/>
-                <w:bCs/>
-                <w:color w:val="000000" w:themeColor="text1"/>
-                <w:sz w:val="21"/>
-                <w:szCs w:val="21"/>
-                <w:shd w:val="clear" w:color="auto" w:fill="FFFFFF"/>
-              </w:rPr>
-            </w:pPr>
-            <w:r>
-              <w:rPr>
-                <w:rFonts w:cstheme="minorHAnsi"/>
-                <w:b/>
-                <w:bCs/>
-                <w:color w:val="000000" w:themeColor="text1"/>
-                <w:sz w:val="21"/>
-                <w:szCs w:val="21"/>
-                <w:shd w:val="clear" w:color="auto" w:fill="FFFFFF"/>
-              </w:rPr>
-              <w:t>Recursos Humanos</w:t>
-            </w:r>
-          </w:p>
-        </w:tc>
-        <w:tc>
-          <w:tcPr>
-            <w:tcW w:w="1139" w:type="dxa"/>
-          </w:tcPr>
-          <w:p>
-            <w:pPr>
-              <w:rPr>
-                <w:rFonts w:cstheme="minorHAnsi"/>
-                <w:color w:val="000000" w:themeColor="text1"/>
-                <w:sz w:val="21"/>
-                <w:szCs w:val="21"/>
-                <w:shd w:val="clear" w:color="auto" w:fill="FFFFFF"/>
-              </w:rPr>
-            </w:pPr>
-            <w:r>
-              <w:rPr>
-                <w:rFonts w:cstheme="minorHAnsi"/>
-                <w:color w:val="000000" w:themeColor="text1"/>
-                <w:sz w:val="21"/>
-                <w:szCs w:val="21"/>
-                <w:shd w:val="clear" w:color="auto" w:fill="FFFFFF"/>
-              </w:rPr>
-              <w:t>8</w:t>
-            </w:r>
-          </w:p>
-        </w:tc>
-        <w:tc>
-          <w:tcPr>
-            <w:tcW w:w="1997" w:type="dxa"/>
-          </w:tcPr>
-          <w:p>
-            <w:pPr>
-              <w:rPr>
-                <w:rFonts w:cstheme="minorHAnsi"/>
-                <w:color w:val="000000" w:themeColor="text1"/>
-                <w:sz w:val="21"/>
-                <w:szCs w:val="21"/>
-                <w:shd w:val="clear" w:color="auto" w:fill="FFFFFF"/>
-              </w:rPr>
-            </w:pPr>
-            <w:r>
-              <w:t>datos de empleados</w:t>
-            </w:r>
-          </w:p>
-        </w:tc>
-        <w:tc>
-          <w:tcPr>
-            <w:tcW w:w="1309" w:type="dxa"/>
-          </w:tcPr>
-          <w:p>
-            <w:pPr>
-              <w:jc w:val="center"/>
-              <w:rPr>
-                <w:rFonts w:cstheme="minorHAnsi"/>
-                <w:b/>
-                <w:bCs/>
-                <w:color w:val="000000" w:themeColor="text1"/>
-                <w:sz w:val="21"/>
-                <w:szCs w:val="21"/>
-                <w:shd w:val="clear" w:color="auto" w:fill="FFFFFF"/>
-              </w:rPr>
-            </w:pPr>
-            <w:r>
-              <w:rPr>
-                <w:rFonts w:cstheme="minorHAnsi"/>
-                <w:b/>
-                <w:bCs/>
-                <w:color w:val="000000" w:themeColor="text1"/>
-                <w:sz w:val="21"/>
-                <w:szCs w:val="21"/>
-                <w:shd w:val="clear" w:color="auto" w:fill="FFFFFF"/>
-              </w:rPr>
-              <w:t>Estrella</w:t>
-            </w:r>
-          </w:p>
-        </w:tc>
-        <w:tc>
-          <w:tcPr>
-            <w:tcW w:w="3981" w:type="dxa"/>
-          </w:tcPr>
-          <w:p>
-            <w:pPr>
-              <w:rPr>
-                <w:rFonts w:cstheme="minorHAnsi"/>
-                <w:color w:val="000000" w:themeColor="text1"/>
-                <w:sz w:val="21"/>
-                <w:szCs w:val="21"/>
-                <w:shd w:val="clear" w:color="auto" w:fill="FFFFFF"/>
-              </w:rPr>
-            </w:pPr>
-            <w:r>
-              <w:t>El switch aísla su tráfico del resto; con 8 hosts no se justifica costo extra de árbol/malla</w:t>
-            </w:r>
-          </w:p>
-        </w:tc>
-      </w:tr>
-      <w:tr>
-        <w:trPr>
-          <w:trHeight w:val="831"/>
-        </w:trPr>
-        <w:tc>
-          <w:tcPr>
-            <w:tcW w:w="1550" w:type="dxa"/>
-          </w:tcPr>
-          <w:p>
-            <w:pPr>
-              <w:rPr>
-                <w:rFonts w:cstheme="minorHAnsi"/>
-                <w:b/>
-                <w:bCs/>
-                <w:color w:val="000000" w:themeColor="text1"/>
-                <w:sz w:val="21"/>
-                <w:szCs w:val="21"/>
-                <w:shd w:val="clear" w:color="auto" w:fill="FFFFFF"/>
-              </w:rPr>
-            </w:pPr>
-          </w:p>
-          <w:p>
-            <w:pPr>
-              <w:rPr>
-                <w:rFonts w:cstheme="minorHAnsi"/>
-                <w:b/>
-                <w:bCs/>
-                <w:color w:val="000000" w:themeColor="text1"/>
-                <w:sz w:val="21"/>
-                <w:szCs w:val="21"/>
-                <w:shd w:val="clear" w:color="auto" w:fill="FFFFFF"/>
-              </w:rPr>
-            </w:pPr>
-            <w:r>
-              <w:rPr>
-                <w:rFonts w:cstheme="minorHAnsi"/>
-                <w:b/>
-                <w:bCs/>
-                <w:color w:val="000000" w:themeColor="text1"/>
-                <w:sz w:val="21"/>
-                <w:szCs w:val="21"/>
-                <w:shd w:val="clear" w:color="auto" w:fill="FFFFFF"/>
-              </w:rPr>
-              <w:t>Legal</w:t>
-            </w:r>
-          </w:p>
-        </w:tc>
-        <w:tc>
-          <w:tcPr>
-            <w:tcW w:w="1139" w:type="dxa"/>
-          </w:tcPr>
-          <w:p>
-            <w:pPr>
-              <w:rPr>
-                <w:rFonts w:cstheme="minorHAnsi"/>
-                <w:color w:val="000000" w:themeColor="text1"/>
-                <w:sz w:val="21"/>
-                <w:szCs w:val="21"/>
-                <w:shd w:val="clear" w:color="auto" w:fill="FFFFFF"/>
-              </w:rPr>
-            </w:pPr>
-            <w:r>
-              <w:rPr>
-                <w:rFonts w:cstheme="minorHAnsi"/>
-                <w:color w:val="000000" w:themeColor="text1"/>
-                <w:sz w:val="21"/>
-                <w:szCs w:val="21"/>
-                <w:shd w:val="clear" w:color="auto" w:fill="FFFFFF"/>
-              </w:rPr>
-              <w:t>4</w:t>
-            </w:r>
-          </w:p>
-        </w:tc>
-        <w:tc>
-          <w:tcPr>
-            <w:tcW w:w="1997" w:type="dxa"/>
-          </w:tcPr>
-          <w:p>
-            <w:pPr>
-              <w:rPr>
-                <w:rFonts w:cstheme="minorHAnsi"/>
-                <w:color w:val="000000" w:themeColor="text1"/>
-                <w:sz w:val="21"/>
-                <w:szCs w:val="21"/>
-                <w:shd w:val="clear" w:color="auto" w:fill="FFFFFF"/>
-              </w:rPr>
-            </w:pPr>
-            <w:r>
-              <w:t>documentos confidenciales</w:t>
-            </w:r>
-          </w:p>
-        </w:tc>
-        <w:tc>
-          <w:tcPr>
-            <w:tcW w:w="1309" w:type="dxa"/>
-          </w:tcPr>
-          <w:p>
-            <w:pPr>
-              <w:jc w:val="center"/>
-              <w:rPr>
-                <w:rFonts w:cstheme="minorHAnsi"/>
-                <w:b/>
-                <w:bCs/>
-                <w:color w:val="000000" w:themeColor="text1"/>
-                <w:sz w:val="21"/>
-                <w:szCs w:val="21"/>
-                <w:shd w:val="clear" w:color="auto" w:fill="FFFFFF"/>
-              </w:rPr>
-            </w:pPr>
-            <w:r>
-              <w:rPr>
-                <w:rFonts w:cstheme="minorHAnsi"/>
-                <w:b/>
-                <w:bCs/>
-                <w:color w:val="000000" w:themeColor="text1"/>
-                <w:sz w:val="21"/>
-                <w:szCs w:val="21"/>
-                <w:shd w:val="clear" w:color="auto" w:fill="FFFFFF"/>
-              </w:rPr>
-              <w:t>Estrella</w:t>
-            </w:r>
-          </w:p>
-        </w:tc>
-        <w:tc>
-          <w:tcPr>
-            <w:tcW w:w="3981" w:type="dxa"/>
-          </w:tcPr>
-          <w:p>
-            <w:pPr>
-              <w:rPr>
-                <w:rFonts w:cstheme="minorHAnsi"/>
-                <w:color w:val="000000" w:themeColor="text1"/>
-                <w:sz w:val="21"/>
-                <w:szCs w:val="21"/>
-                <w:shd w:val="clear" w:color="auto" w:fill="FFFFFF"/>
-              </w:rPr>
-            </w:pPr>
-            <w:r>
-              <w:t>Segmento pequeño pero sensible; la estrella permite aplicar seguridad a nivel de switch sin sobrecosto</w:t>
-            </w:r>
-          </w:p>
-        </w:tc>
-      </w:tr>
-      <w:tr>
-        <w:trPr>
-          <w:trHeight w:val="831"/>
-        </w:trPr>
-        <w:tc>
-          <w:tcPr>
-            <w:tcW w:w="1550" w:type="dxa"/>
-          </w:tcPr>
-          <w:p>
-            <w:pPr>
-              <w:rPr>
-                <w:rFonts w:cstheme="minorHAnsi"/>
-                <w:b/>
-                <w:bCs/>
-                <w:color w:val="000000" w:themeColor="text1"/>
-                <w:sz w:val="21"/>
-                <w:szCs w:val="21"/>
-                <w:shd w:val="clear" w:color="auto" w:fill="FFFFFF"/>
-              </w:rPr>
-            </w:pPr>
-          </w:p>
-          <w:p>
-            <w:pPr>
-              <w:rPr>
-                <w:rFonts w:cstheme="minorHAnsi"/>
-                <w:b/>
-                <w:bCs/>
-                <w:color w:val="000000" w:themeColor="text1"/>
-                <w:sz w:val="21"/>
-                <w:szCs w:val="21"/>
-                <w:shd w:val="clear" w:color="auto" w:fill="FFFFFF"/>
-              </w:rPr>
-            </w:pPr>
-            <w:r>
-              <w:rPr>
-                <w:rFonts w:cstheme="minorHAnsi"/>
-                <w:b/>
-                <w:bCs/>
-                <w:color w:val="000000" w:themeColor="text1"/>
-                <w:sz w:val="21"/>
-                <w:szCs w:val="21"/>
-                <w:shd w:val="clear" w:color="auto" w:fill="FFFFFF"/>
-              </w:rPr>
-              <w:t>Capacitación</w:t>
-            </w:r>
-          </w:p>
-        </w:tc>
-        <w:tc>
-          <w:tcPr>
-            <w:tcW w:w="1139" w:type="dxa"/>
-          </w:tcPr>
-          <w:p>
-            <w:pPr>
-              <w:rPr>
-                <w:rFonts w:cstheme="minorHAnsi"/>
-                <w:color w:val="000000" w:themeColor="text1"/>
-                <w:sz w:val="21"/>
-                <w:szCs w:val="21"/>
-                <w:shd w:val="clear" w:color="auto" w:fill="FFFFFF"/>
-              </w:rPr>
-            </w:pPr>
-            <w:r>
-              <w:rPr>
-                <w:rFonts w:cstheme="minorHAnsi"/>
-                <w:color w:val="000000" w:themeColor="text1"/>
-                <w:sz w:val="21"/>
-                <w:szCs w:val="21"/>
-                <w:shd w:val="clear" w:color="auto" w:fill="FFFFFF"/>
-              </w:rPr>
-              <w:t>10</w:t>
-            </w:r>
-          </w:p>
-        </w:tc>
-        <w:tc>
-          <w:tcPr>
-            <w:tcW w:w="1997" w:type="dxa"/>
-          </w:tcPr>
-          <w:p>
-            <w:pPr>
-              <w:rPr>
-                <w:rFonts w:cstheme="minorHAnsi"/>
-                <w:color w:val="000000" w:themeColor="text1"/>
-                <w:sz w:val="21"/>
-                <w:szCs w:val="21"/>
-                <w:shd w:val="clear" w:color="auto" w:fill="FFFFFF"/>
-              </w:rPr>
-            </w:pPr>
-            <w:r>
-              <w:t>uso temporal/rotativo</w:t>
-            </w:r>
-          </w:p>
-        </w:tc>
-        <w:tc>
-          <w:tcPr>
-            <w:tcW w:w="1309" w:type="dxa"/>
-          </w:tcPr>
-          <w:p>
-            <w:pPr>
-              <w:jc w:val="center"/>
-              <w:rPr>
-                <w:rFonts w:cstheme="minorHAnsi"/>
-                <w:b/>
-                <w:bCs/>
-                <w:color w:val="000000" w:themeColor="text1"/>
-                <w:sz w:val="21"/>
-                <w:szCs w:val="21"/>
-                <w:shd w:val="clear" w:color="auto" w:fill="FFFFFF"/>
-              </w:rPr>
-            </w:pPr>
-            <w:r>
-              <w:rPr>
-                <w:rFonts w:cstheme="minorHAnsi"/>
-                <w:b/>
-                <w:bCs/>
-                <w:color w:val="000000" w:themeColor="text1"/>
-                <w:sz w:val="21"/>
-                <w:szCs w:val="21"/>
-                <w:shd w:val="clear" w:color="auto" w:fill="FFFFFF"/>
-              </w:rPr>
-              <w:t>Estrella</w:t>
-            </w:r>
-          </w:p>
-        </w:tc>
-        <w:tc>
-          <w:tcPr>
-            <w:tcW w:w="3981" w:type="dxa"/>
-          </w:tcPr>
-          <w:p>
-            <w:pPr>
-              <w:rPr>
-                <w:rFonts w:cstheme="minorHAnsi"/>
-                <w:color w:val="000000" w:themeColor="text1"/>
-                <w:sz w:val="21"/>
-                <w:szCs w:val="21"/>
-                <w:shd w:val="clear" w:color="auto" w:fill="FFFFFF"/>
-              </w:rPr>
-            </w:pPr>
-            <w:r>
-              <w:t>Mayor cantidad de hosts del edificio; estrella escala bien dejando puertos libres para picos de uso</w:t>
-            </w:r>
-          </w:p>
-        </w:tc>
-      </w:tr>
-      <w:tr>
-        <w:trPr>
-          <w:trHeight w:val="546"/>
-        </w:trPr>
-        <w:tc>
-          <w:tcPr>
-            <w:tcW w:w="1550" w:type="dxa"/>
-          </w:tcPr>
-          <w:p>
-            <w:pPr>
-              <w:rPr>
-                <w:rFonts w:cstheme="minorHAnsi"/>
-                <w:b/>
-                <w:bCs/>
-                <w:color w:val="000000" w:themeColor="text1"/>
-                <w:sz w:val="21"/>
-                <w:szCs w:val="21"/>
-                <w:shd w:val="clear" w:color="auto" w:fill="FFFFFF"/>
-              </w:rPr>
-            </w:pPr>
-            <w:r>
-              <w:rPr>
-                <w:rFonts w:cstheme="minorHAnsi"/>
-                <w:b/>
-                <w:bCs/>
-                <w:color w:val="000000" w:themeColor="text1"/>
-                <w:sz w:val="21"/>
-                <w:szCs w:val="21"/>
-                <w:shd w:val="clear" w:color="auto" w:fill="FFFFFF"/>
-              </w:rPr>
-              <w:t>Diseño e Innovación</w:t>
-            </w:r>
-          </w:p>
-        </w:tc>
-        <w:tc>
-          <w:tcPr>
-            <w:tcW w:w="1139" w:type="dxa"/>
-          </w:tcPr>
-          <w:p>
-            <w:pPr>
-              <w:rPr>
-                <w:rFonts w:cstheme="minorHAnsi"/>
-                <w:color w:val="000000" w:themeColor="text1"/>
-                <w:sz w:val="21"/>
-                <w:szCs w:val="21"/>
-                <w:shd w:val="clear" w:color="auto" w:fill="FFFFFF"/>
-              </w:rPr>
-            </w:pPr>
-            <w:r>
-              <w:rPr>
-                <w:rFonts w:cstheme="minorHAnsi"/>
-                <w:color w:val="000000" w:themeColor="text1"/>
-                <w:sz w:val="21"/>
-                <w:szCs w:val="21"/>
-                <w:shd w:val="clear" w:color="auto" w:fill="FFFFFF"/>
-              </w:rPr>
-              <w:t xml:space="preserve">7 + </w:t>
-            </w:r>
-            <w:r>
-              <w:rPr>
-                <w:rFonts w:cstheme="minorHAnsi"/>
-                <w:color w:val="000000" w:themeColor="text1"/>
-                <w:sz w:val="21"/>
-                <w:szCs w:val="21"/>
-                <w:shd w:val="clear" w:color="auto" w:fill="FFFFFF"/>
-              </w:rPr>
-              <w:br/>
-              <w:t>1 servidor</w:t>
-            </w:r>
-          </w:p>
-        </w:tc>
-        <w:tc>
-          <w:tcPr>
-            <w:tcW w:w="1997" w:type="dxa"/>
-          </w:tcPr>
-          <w:p>
-            <w:pPr>
-              <w:rPr>
-                <w:rFonts w:cstheme="minorHAnsi"/>
-                <w:color w:val="000000" w:themeColor="text1"/>
-                <w:sz w:val="21"/>
-                <w:szCs w:val="21"/>
-                <w:shd w:val="clear" w:color="auto" w:fill="FFFFFF"/>
-              </w:rPr>
-            </w:pPr>
-            <w:r>
-              <w:t>incluye QA y un servidor</w:t>
-            </w:r>
-          </w:p>
-        </w:tc>
-        <w:tc>
-          <w:tcPr>
-            <w:tcW w:w="1309" w:type="dxa"/>
-          </w:tcPr>
-          <w:p>
-            <w:pPr>
-              <w:jc w:val="center"/>
-              <w:rPr>
-                <w:rFonts w:cstheme="minorHAnsi"/>
-                <w:b/>
-                <w:bCs/>
-                <w:color w:val="000000" w:themeColor="text1"/>
-                <w:sz w:val="21"/>
-                <w:szCs w:val="21"/>
-                <w:shd w:val="clear" w:color="auto" w:fill="FFFFFF"/>
-              </w:rPr>
-            </w:pPr>
-            <w:r>
-              <w:rPr>
-                <w:rFonts w:cstheme="minorHAnsi"/>
-                <w:b/>
-                <w:bCs/>
-                <w:color w:val="000000" w:themeColor="text1"/>
-                <w:sz w:val="21"/>
-                <w:szCs w:val="21"/>
-                <w:shd w:val="clear" w:color="auto" w:fill="FFFFFF"/>
-              </w:rPr>
-              <w:t>Estrella</w:t>
-            </w:r>
-          </w:p>
-        </w:tc>
-        <w:tc>
-          <w:tcPr>
-            <w:tcW w:w="3981" w:type="dxa"/>
-          </w:tcPr>
-          <w:p>
-            <w:pPr>
-              <w:rPr>
-                <w:rFonts w:cstheme="minorHAnsi"/>
-                <w:color w:val="000000" w:themeColor="text1"/>
-                <w:sz w:val="21"/>
-                <w:szCs w:val="21"/>
-                <w:shd w:val="clear" w:color="auto" w:fill="FFFFFF"/>
-              </w:rPr>
-            </w:pPr>
-            <w:r>
-              <w:t>Aísla fallos: si un host falla no afecta al servidor ni a los demás puestos</w:t>
-            </w:r>
-          </w:p>
-        </w:tc>
-      </w:tr>
-      <w:tr>
-        <w:trPr>
-          <w:trHeight w:val="568"/>
-        </w:trPr>
-        <w:tc>
-          <w:tcPr>
-            <w:tcW w:w="1550" w:type="dxa"/>
-          </w:tcPr>
-          <w:p>
-            <w:pPr>
-              <w:rPr>
-                <w:rFonts w:cstheme="minorHAnsi"/>
-                <w:b/>
-                <w:bCs/>
-                <w:color w:val="000000" w:themeColor="text1"/>
-                <w:sz w:val="21"/>
-                <w:szCs w:val="21"/>
-                <w:shd w:val="clear" w:color="auto" w:fill="FFFFFF"/>
-              </w:rPr>
-            </w:pPr>
-            <w:r>
-              <w:rPr>
-                <w:rFonts w:cstheme="minorHAnsi"/>
-                <w:b/>
-                <w:bCs/>
-                <w:color w:val="000000" w:themeColor="text1"/>
-                <w:sz w:val="21"/>
-                <w:szCs w:val="21"/>
-                <w:shd w:val="clear" w:color="auto" w:fill="FFFFFF"/>
-              </w:rPr>
-              <w:t>Dirección General</w:t>
-            </w:r>
-          </w:p>
-        </w:tc>
-        <w:tc>
-          <w:tcPr>
-            <w:tcW w:w="1139" w:type="dxa"/>
-          </w:tcPr>
-          <w:p>
-            <w:pPr>
-              <w:rPr>
-                <w:rFonts w:cstheme="minorHAnsi"/>
-                <w:color w:val="000000" w:themeColor="text1"/>
-                <w:sz w:val="21"/>
-                <w:szCs w:val="21"/>
-                <w:shd w:val="clear" w:color="auto" w:fill="FFFFFF"/>
-              </w:rPr>
-            </w:pPr>
-            <w:r>
-              <w:rPr>
-                <w:rFonts w:cstheme="minorHAnsi"/>
-                <w:color w:val="000000" w:themeColor="text1"/>
-                <w:sz w:val="21"/>
-                <w:szCs w:val="21"/>
-                <w:shd w:val="clear" w:color="auto" w:fill="FFFFFF"/>
-              </w:rPr>
-              <w:t>4</w:t>
-            </w:r>
-          </w:p>
-        </w:tc>
-        <w:tc>
-          <w:tcPr>
-            <w:tcW w:w="1997" w:type="dxa"/>
-          </w:tcPr>
-          <w:p>
-            <w:pPr>
-              <w:rPr>
-                <w:rFonts w:cstheme="minorHAnsi"/>
-                <w:color w:val="000000" w:themeColor="text1"/>
-                <w:sz w:val="21"/>
-                <w:szCs w:val="21"/>
-                <w:shd w:val="clear" w:color="auto" w:fill="FFFFFF"/>
-              </w:rPr>
-            </w:pPr>
-            <w:r>
-              <w:t>gestión estratégica</w:t>
-            </w:r>
-          </w:p>
-        </w:tc>
-        <w:tc>
-          <w:tcPr>
-            <w:tcW w:w="1309" w:type="dxa"/>
-          </w:tcPr>
-          <w:p>
-            <w:pPr>
-              <w:jc w:val="center"/>
-              <w:rPr>
-                <w:rFonts w:cstheme="minorHAnsi"/>
-                <w:b/>
-                <w:bCs/>
-                <w:color w:val="000000" w:themeColor="text1"/>
-                <w:sz w:val="21"/>
-                <w:szCs w:val="21"/>
-                <w:shd w:val="clear" w:color="auto" w:fill="FFFFFF"/>
-              </w:rPr>
-            </w:pPr>
-            <w:r>
-              <w:rPr>
-                <w:rFonts w:cstheme="minorHAnsi"/>
-                <w:b/>
-                <w:bCs/>
-                <w:color w:val="000000" w:themeColor="text1"/>
-                <w:sz w:val="21"/>
-                <w:szCs w:val="21"/>
-                <w:shd w:val="clear" w:color="auto" w:fill="FFFFFF"/>
-              </w:rPr>
-              <w:t>Estrella</w:t>
-            </w:r>
-          </w:p>
-        </w:tc>
-        <w:tc>
-          <w:tcPr>
-            <w:tcW w:w="3981" w:type="dxa"/>
-          </w:tcPr>
-          <w:p>
-            <w:pPr>
-              <w:rPr>
-                <w:rFonts w:cstheme="minorHAnsi"/>
-                <w:color w:val="000000" w:themeColor="text1"/>
-                <w:sz w:val="21"/>
-                <w:szCs w:val="21"/>
-                <w:shd w:val="clear" w:color="auto" w:fill="FFFFFF"/>
-              </w:rPr>
-            </w:pPr>
-            <w:r>
-              <w:t>Segmento pequeño; estrella simple es suficiente y fácil de asegurar físicamente</w:t>
-            </w:r>
-          </w:p>
-        </w:tc>
-      </w:tr>
-      <w:tr>
-        <w:trPr>
-          <w:trHeight w:val="546"/>
-        </w:trPr>
-        <w:tc>
-          <w:tcPr>
-            <w:tcW w:w="1550" w:type="dxa"/>
-          </w:tcPr>
-          <w:p>
-            <w:pPr>
-              <w:rPr>
-                <w:rFonts w:cstheme="minorHAnsi"/>
-                <w:b/>
-                <w:bCs/>
-                <w:color w:val="000000" w:themeColor="text1"/>
-                <w:sz w:val="21"/>
-                <w:szCs w:val="21"/>
-                <w:shd w:val="clear" w:color="auto" w:fill="FFFFFF"/>
-              </w:rPr>
-            </w:pPr>
-          </w:p>
-          <w:p>
-            <w:pPr>
-              <w:rPr>
-                <w:rFonts w:cstheme="minorHAnsi"/>
-                <w:b/>
-                <w:bCs/>
-                <w:color w:val="000000" w:themeColor="text1"/>
-                <w:sz w:val="21"/>
-                <w:szCs w:val="21"/>
-                <w:shd w:val="clear" w:color="auto" w:fill="FFFFFF"/>
-              </w:rPr>
-            </w:pPr>
-            <w:r>
-              <w:rPr>
-                <w:rFonts w:cstheme="minorHAnsi"/>
-                <w:b/>
-                <w:bCs/>
-                <w:color w:val="000000" w:themeColor="text1"/>
-                <w:sz w:val="21"/>
-                <w:szCs w:val="21"/>
-                <w:shd w:val="clear" w:color="auto" w:fill="FFFFFF"/>
-              </w:rPr>
-              <w:t>Backend</w:t>
-            </w:r>
-          </w:p>
-        </w:tc>
-        <w:tc>
-          <w:tcPr>
-            <w:tcW w:w="1139" w:type="dxa"/>
-          </w:tcPr>
-          <w:p>
-            <w:pPr>
-              <w:rPr>
-                <w:rFonts w:cstheme="minorHAnsi"/>
-                <w:color w:val="000000" w:themeColor="text1"/>
-                <w:sz w:val="21"/>
-                <w:szCs w:val="21"/>
-                <w:shd w:val="clear" w:color="auto" w:fill="FFFFFF"/>
-              </w:rPr>
-            </w:pPr>
-            <w:r>
-              <w:rPr>
-                <w:rFonts w:cstheme="minorHAnsi"/>
-                <w:color w:val="000000" w:themeColor="text1"/>
-                <w:sz w:val="21"/>
-                <w:szCs w:val="21"/>
-                <w:shd w:val="clear" w:color="auto" w:fill="FFFFFF"/>
-              </w:rPr>
-              <w:t>6 +</w:t>
-            </w:r>
-            <w:r>
-              <w:rPr>
-                <w:rFonts w:cstheme="minorHAnsi"/>
-                <w:color w:val="000000" w:themeColor="text1"/>
-                <w:sz w:val="21"/>
-                <w:szCs w:val="21"/>
-                <w:shd w:val="clear" w:color="auto" w:fill="FFFFFF"/>
-              </w:rPr>
-              <w:br/>
-            </w:r>
-            <w:r>
-              <w:rPr>
-                <w:rFonts w:cstheme="minorHAnsi"/>
-                <w:color w:val="000000" w:themeColor="text1"/>
-                <w:sz w:val="21"/>
-                <w:szCs w:val="21"/>
-                <w:shd w:val="clear" w:color="auto" w:fill="FFFFFF"/>
-              </w:rPr>
-              <w:t xml:space="preserve">  1 servidor</w:t>
-            </w:r>
-          </w:p>
-        </w:tc>
-        <w:tc>
-          <w:tcPr>
-            <w:tcW w:w="1997" w:type="dxa"/>
-          </w:tcPr>
-          <w:p>
-            <w:pPr>
-              <w:rPr>
-                <w:rFonts w:cstheme="minorHAnsi"/>
-                <w:color w:val="000000" w:themeColor="text1"/>
-                <w:sz w:val="21"/>
-                <w:szCs w:val="21"/>
-                <w:shd w:val="clear" w:color="auto" w:fill="FFFFFF"/>
-              </w:rPr>
-            </w:pPr>
-            <w:r>
-              <w:t>servidor de desarrollo</w:t>
-            </w:r>
-          </w:p>
-        </w:tc>
-        <w:tc>
-          <w:tcPr>
-            <w:tcW w:w="1309" w:type="dxa"/>
-          </w:tcPr>
-          <w:p>
-            <w:pPr>
-              <w:jc w:val="center"/>
-              <w:rPr>
-                <w:rFonts w:cstheme="minorHAnsi"/>
-                <w:b/>
-                <w:bCs/>
-                <w:color w:val="000000" w:themeColor="text1"/>
-                <w:sz w:val="21"/>
-                <w:szCs w:val="21"/>
-                <w:shd w:val="clear" w:color="auto" w:fill="FFFFFF"/>
-              </w:rPr>
-            </w:pPr>
-            <w:r>
-              <w:rPr>
-                <w:rFonts w:cstheme="minorHAnsi"/>
-                <w:b/>
-                <w:bCs/>
-                <w:color w:val="000000" w:themeColor="text1"/>
-                <w:sz w:val="21"/>
-                <w:szCs w:val="21"/>
-                <w:shd w:val="clear" w:color="auto" w:fill="FFFFFF"/>
-              </w:rPr>
-              <w:t>Estrella</w:t>
-            </w:r>
-          </w:p>
-        </w:tc>
-        <w:tc>
-          <w:tcPr>
-            <w:tcW w:w="3981" w:type="dxa"/>
-          </w:tcPr>
-          <w:p>
-            <w:pPr>
-              <w:rPr>
-                <w:rFonts w:cstheme="minorHAnsi"/>
-                <w:color w:val="000000" w:themeColor="text1"/>
-                <w:sz w:val="21"/>
-                <w:szCs w:val="21"/>
-                <w:shd w:val="clear" w:color="auto" w:fill="FFFFFF"/>
-              </w:rPr>
-            </w:pPr>
-            <w:r>
-              <w:t>Prioriza tolerancia a fallos por host individual; costo bajo para 6 puestos</w:t>
-            </w:r>
-          </w:p>
-        </w:tc>
-      </w:tr>
-      <w:tr>
-        <w:trPr>
-          <w:trHeight w:val="831"/>
-        </w:trPr>
-        <w:tc>
-          <w:tcPr>
-            <w:tcW w:w="1550" w:type="dxa"/>
-          </w:tcPr>
-          <w:p>
-            <w:pPr>
-              <w:rPr>
-                <w:rFonts w:cstheme="minorHAnsi"/>
-                <w:b/>
-                <w:bCs/>
-                <w:color w:val="000000" w:themeColor="text1"/>
-                <w:sz w:val="21"/>
-                <w:szCs w:val="21"/>
-                <w:shd w:val="clear" w:color="auto" w:fill="FFFFFF"/>
-              </w:rPr>
-            </w:pPr>
-          </w:p>
-          <w:p>
-            <w:pPr>
-              <w:rPr>
-                <w:rFonts w:cstheme="minorHAnsi"/>
-                <w:b/>
-                <w:bCs/>
-                <w:color w:val="000000" w:themeColor="text1"/>
-                <w:sz w:val="21"/>
-                <w:szCs w:val="21"/>
-                <w:shd w:val="clear" w:color="auto" w:fill="FFFFFF"/>
-              </w:rPr>
-            </w:pPr>
-          </w:p>
-          <w:p>
-            <w:pPr>
-              <w:rPr>
-                <w:rFonts w:cstheme="minorHAnsi"/>
-                <w:b/>
-                <w:bCs/>
-                <w:color w:val="000000" w:themeColor="text1"/>
-                <w:sz w:val="21"/>
-                <w:szCs w:val="21"/>
-                <w:shd w:val="clear" w:color="auto" w:fill="FFFFFF"/>
-              </w:rPr>
-            </w:pPr>
-            <w:r>
-              <w:rPr>
-                <w:rFonts w:cstheme="minorHAnsi"/>
-                <w:b/>
-                <w:bCs/>
-                <w:color w:val="000000" w:themeColor="text1"/>
-                <w:sz w:val="21"/>
-                <w:szCs w:val="21"/>
-                <w:shd w:val="clear" w:color="auto" w:fill="FFFFFF"/>
-              </w:rPr>
-              <w:t>Data center</w:t>
-            </w:r>
-          </w:p>
-        </w:tc>
-        <w:tc>
-          <w:tcPr>
-            <w:tcW w:w="1139" w:type="dxa"/>
-          </w:tcPr>
-          <w:p>
-            <w:pPr>
-              <w:rPr>
-                <w:rFonts w:cstheme="minorHAnsi"/>
-                <w:color w:val="000000" w:themeColor="text1"/>
-                <w:sz w:val="21"/>
-                <w:szCs w:val="21"/>
-                <w:shd w:val="clear" w:color="auto" w:fill="FFFFFF"/>
-              </w:rPr>
-            </w:pPr>
-            <w:r>
-              <w:rPr>
-                <w:rFonts w:cstheme="minorHAnsi"/>
-                <w:color w:val="000000" w:themeColor="text1"/>
-                <w:sz w:val="21"/>
-                <w:szCs w:val="21"/>
-                <w:shd w:val="clear" w:color="auto" w:fill="FFFFFF"/>
-              </w:rPr>
-              <w:t>3 servidores</w:t>
-            </w:r>
-          </w:p>
-        </w:tc>
-        <w:tc>
-          <w:tcPr>
-            <w:tcW w:w="1997" w:type="dxa"/>
-          </w:tcPr>
-          <w:p>
-            <w:pPr>
-              <w:rPr>
-                <w:rFonts w:cstheme="minorHAnsi"/>
-                <w:color w:val="000000" w:themeColor="text1"/>
-                <w:sz w:val="21"/>
-                <w:szCs w:val="21"/>
-                <w:shd w:val="clear" w:color="auto" w:fill="FFFFFF"/>
-              </w:rPr>
-            </w:pPr>
-            <w:r>
-              <w:t>servidores principales</w:t>
-            </w:r>
-          </w:p>
-        </w:tc>
-        <w:tc>
-          <w:tcPr>
-            <w:tcW w:w="1309" w:type="dxa"/>
-          </w:tcPr>
-          <w:p>
-            <w:pPr>
-              <w:jc w:val="center"/>
-              <w:rPr>
-                <w:rFonts w:cstheme="minorHAnsi"/>
-                <w:b/>
-                <w:bCs/>
-                <w:color w:val="000000" w:themeColor="text1"/>
-                <w:sz w:val="21"/>
-                <w:szCs w:val="21"/>
-                <w:shd w:val="clear" w:color="auto" w:fill="FFFFFF"/>
-              </w:rPr>
-            </w:pPr>
-            <w:r>
-              <w:rPr>
-                <w:rFonts w:cstheme="minorHAnsi"/>
-                <w:b/>
-                <w:bCs/>
-                <w:color w:val="000000" w:themeColor="text1"/>
-                <w:sz w:val="21"/>
-                <w:szCs w:val="21"/>
-                <w:shd w:val="clear" w:color="auto" w:fill="FFFFFF"/>
-              </w:rPr>
-              <w:t>Estrella</w:t>
-            </w:r>
-          </w:p>
-        </w:tc>
-        <w:tc>
-          <w:tcPr>
-            <w:tcW w:w="3981" w:type="dxa"/>
-          </w:tcPr>
-          <w:p>
-            <w:pPr>
-              <w:rPr>
-                <w:rFonts w:cstheme="minorHAnsi"/>
-                <w:color w:val="000000" w:themeColor="text1"/>
-                <w:sz w:val="21"/>
-                <w:szCs w:val="21"/>
-                <w:shd w:val="clear" w:color="auto" w:fill="FFFFFF"/>
-              </w:rPr>
-            </w:pPr>
-            <w:r>
-              <w:t>Con solo 3 nodos, estrella es más que suficiente; los 3 servidores no compiten por ancho de banda entre sí</w:t>
-            </w:r>
-          </w:p>
-        </w:tc>
-      </w:tr>
-    </w:tbl>
-    <w:p>
-      <w:pPr>
+        <w:drawing>
+          <wp:anchor distT="0" distB="0" distL="114300" distR="114300" simplePos="0" relativeHeight="251658240" behindDoc="0" locked="0" layoutInCell="1" allowOverlap="1" wp14:anchorId="1C5F40DF" wp14:editId="7AEF8A0F">
+            <wp:simplePos x="0" y="0"/>
+            <wp:positionH relativeFrom="margin">
+              <wp:posOffset>-180340</wp:posOffset>
+            </wp:positionH>
+            <wp:positionV relativeFrom="paragraph">
+              <wp:posOffset>481965</wp:posOffset>
+            </wp:positionV>
+            <wp:extent cx="5772150" cy="3997325"/>
+            <wp:effectExtent l="0" t="0" r="0" b="3175"/>
+            <wp:wrapSquare wrapText="bothSides"/>
+            <wp:docPr id="1" name="Imagen 1"/>
+            <wp:cNvGraphicFramePr>
+              <a:graphicFrameLocks xmlns:a="http://schemas.openxmlformats.org/drawingml/2006/main" noChangeAspect="1"/>
+            </wp:cNvGraphicFramePr>
+            <a:graphic xmlns:a="http://schemas.openxmlformats.org/drawingml/2006/main">
+              <a:graphicData uri="http://schemas.openxmlformats.org/drawingml/2006/picture">
+                <pic:pic xmlns:pic="http://schemas.openxmlformats.org/drawingml/2006/picture">
+                  <pic:nvPicPr>
+                    <pic:cNvPr id="1" name="Imagen 1"/>
+                    <pic:cNvPicPr/>
+                  </pic:nvPicPr>
+                  <pic:blipFill>
+                    <a:blip r:embed="rId8" cstate="print">
+                      <a:extLst>
+                        <a:ext uri="{28A0092B-C50C-407E-A947-70E740481C1C}">
+                          <a14:useLocalDpi xmlns:a14="http://schemas.microsoft.com/office/drawing/2010/main" val="0"/>
+                        </a:ext>
+                      </a:extLst>
+                    </a:blip>
+                    <a:stretch>
+                      <a:fillRect/>
+                    </a:stretch>
+                  </pic:blipFill>
+                  <pic:spPr>
+                    <a:xfrm>
+                      <a:off x="0" y="0"/>
+                      <a:ext cx="5772150" cy="3997325"/>
+                    </a:xfrm>
+                    <a:prstGeom prst="rect">
+                      <a:avLst/>
+                    </a:prstGeom>
+                  </pic:spPr>
+                </pic:pic>
+              </a:graphicData>
+            </a:graphic>
+            <wp14:sizeRelH relativeFrom="page">
+              <wp14:pctWidth>0</wp14:pctWidth>
+            </wp14:sizeRelH>
+            <wp14:sizeRelV relativeFrom="page">
+              <wp14:pctHeight>0</wp14:pctHeight>
+            </wp14:sizeRelV>
+          </wp:anchor>
+        </w:drawing>
+      </w:r>
+      <w:r>
         <w:rPr>
           <w:rFonts w:cstheme="minorHAnsi"/>
           <w:b/>
@@ -5006,7 +4115,8 @@
           <w:szCs w:val="21"/>
           <w:shd w:val="clear" w:color="auto" w:fill="FFFFFF"/>
         </w:rPr>
-      </w:pPr>
+        <w:br/>
+      </w:r>
     </w:p>
     <w:p>
       <w:pPr>
@@ -5023,53 +4133,6 @@
     </w:p>
     <w:p>
       <w:pPr>
-        <w:pStyle w:val="Sinespaciado"/>
-      </w:pPr>
-      <w:r>
-        <w:rPr>
-          <w:rStyle w:val="Textoennegrita"/>
-        </w:rPr>
-        <w:t xml:space="preserve">Y para la red completa del edificio: </w:t>
-      </w:r>
-      <w:r>
-        <w:t xml:space="preserve">es una </w:t>
-      </w:r>
-      <w:r>
-        <w:rPr>
-          <w:rStyle w:val="Textoennegrita"/>
-        </w:rPr>
-        <w:t>topología de árbol / estrella extendida</w:t>
-      </w:r>
-      <w:r>
-        <w:t>,</w:t>
-      </w:r>
-      <w:r>
-        <w:br/>
-        <w:t>con el MDF como raíz y cada switch de departamento como rama.</w:t>
-      </w:r>
-      <w:r>
-        <w:br/>
-        <w:t xml:space="preserve"> </w:t>
-      </w:r>
-      <w:r>
-        <w:br/>
-        <w:t xml:space="preserve">Esta es la que le da al edificio escalabilidad y aislamiento de fallas entre departamentos, </w:t>
-      </w:r>
-      <w:r>
-        <w:br/>
-        <w:t>es decir, si por ejemplo departamento Legal se cae, el departamento de Recursos Humanos sigue funcionando normal.</w:t>
-      </w:r>
-    </w:p>
-    <w:p>
-      <w:pPr>
-        <w:pStyle w:val="Sinespaciado"/>
-      </w:pPr>
-      <w:r>
-        <w:t>Descarte la topología malla porque en este contexto (LAN de oficina pequeña, sin redundancia crítica exigida) el costo de cablear cada nodo con todos los demás no es una buena práctica.</w:t>
-      </w:r>
-    </w:p>
-    <w:p>
-      <w:pPr>
         <w:rPr>
           <w:rFonts w:cstheme="minorHAnsi"/>
           <w:b/>
@@ -5171,7 +4234,9 @@
           <w:shd w:val="clear" w:color="auto" w:fill="FFFFFF"/>
         </w:rPr>
       </w:pPr>
-      <w:r>
+    </w:p>
+    <w:p>
+      <w:pPr>
         <w:rPr>
           <w:rFonts w:cstheme="minorHAnsi"/>
           <w:b/>
@@ -5181,33 +4246,14 @@
           <w:szCs w:val="21"/>
           <w:shd w:val="clear" w:color="auto" w:fill="FFFFFF"/>
         </w:rPr>
-        <w:lastRenderedPageBreak/>
-        <w:t>3. Ubicar el CUARTO DE TELECOMUNICACIONES (MDF), y calcular distancias de cableado</w:t>
-      </w:r>
-    </w:p>
-    <w:p>
-      <w:pPr>
-        <w:rPr>
-          <w:rFonts w:cstheme="minorHAnsi"/>
-          <w:color w:val="000000" w:themeColor="text1"/>
-          <w:sz w:val="21"/>
-          <w:szCs w:val="21"/>
-          <w:shd w:val="clear" w:color="auto" w:fill="FFFFFF"/>
-        </w:rPr>
-      </w:pPr>
-      <w:r>
-        <w:rPr>
-          <w:rFonts w:cstheme="minorHAnsi"/>
-          <w:color w:val="000000" w:themeColor="text1"/>
-          <w:sz w:val="21"/>
-          <w:szCs w:val="21"/>
-          <w:shd w:val="clear" w:color="auto" w:fill="FFFFFF"/>
-        </w:rPr>
-        <w:t>Voy a estar utilizando una holgura para no hacer cálculos sobre números justos, es decir dejar un poco más de cable por las dudas.</w:t>
-      </w:r>
-    </w:p>
-    <w:p>
-      <w:pPr>
+      </w:pPr>
+    </w:p>
+    <w:p>
+      <w:pPr>
+        <w:spacing w:after="200" w:line="300" w:lineRule="auto"/>
+        <w:jc w:val="both"/>
+      </w:pPr>
+      <w:r>
         <w:rPr>
           <w:rFonts w:cstheme="minorHAnsi"/>
           <w:b/>
@@ -5217,7 +4263,8 @@
           <w:szCs w:val="21"/>
           <w:shd w:val="clear" w:color="auto" w:fill="FFFFFF"/>
         </w:rPr>
-      </w:pPr>
+        <w:t>3. Ubicar el CUARTO DE TELECOMUNICACIONES (MDF), y calcular distancias de cableado</w:t>
+      </w:r>
       <w:r>
         <w:rPr>
           <w:rFonts w:cstheme="minorHAnsi"/>
@@ -5228,214 +4275,96 @@
           <w:szCs w:val="21"/>
           <w:shd w:val="clear" w:color="auto" w:fill="FFFFFF"/>
         </w:rPr>
-        <w:t>Holgura de 10% para cada departamento:</w:t>
-      </w:r>
-    </w:p>
-    <w:p>
-      <w:pPr>
+        <w:br/>
+      </w:r>
+      <w:r>
         <w:rPr>
           <w:rFonts w:cstheme="minorHAnsi"/>
+          <w:b/>
+          <w:bCs/>
           <w:color w:val="000000" w:themeColor="text1"/>
           <w:sz w:val="21"/>
           <w:szCs w:val="21"/>
           <w:shd w:val="clear" w:color="auto" w:fill="FFFFFF"/>
         </w:rPr>
-      </w:pPr>
-      <w:r>
-        <w:rPr>
-          <w:rFonts w:cstheme="minorHAnsi"/>
-          <w:color w:val="000000" w:themeColor="text1"/>
-          <w:sz w:val="21"/>
-          <w:szCs w:val="21"/>
-          <w:shd w:val="clear" w:color="auto" w:fill="FFFFFF"/>
-        </w:rPr>
-        <w:t>Fórmula que voy a estar utilizando:</w:t>
-      </w:r>
-      <w:r>
-        <w:rPr>
-          <w:rFonts w:cstheme="minorHAnsi"/>
-          <w:color w:val="000000" w:themeColor="text1"/>
-          <w:sz w:val="21"/>
-          <w:szCs w:val="21"/>
-          <w:shd w:val="clear" w:color="auto" w:fill="FFFFFF"/>
-        </w:rPr>
         <w:br/>
       </w:r>
       <w:r>
-        <w:rPr>
-          <w:b/>
-          <w:bCs/>
-        </w:rPr>
-        <w:t>Distancia con holgura = (horizontal + vertical) × (1 + %</w:t>
-      </w:r>
-      <w:r>
-        <w:rPr>
-          <w:b/>
-          <w:bCs/>
-        </w:rPr>
-        <w:t xml:space="preserve"> </w:t>
-      </w:r>
-      <w:r>
-        <w:rPr>
-          <w:b/>
-          <w:bCs/>
-        </w:rPr>
-        <w:t>holgura)</w:t>
-      </w:r>
-      <w:r>
-        <w:rPr>
-          <w:b/>
-          <w:bCs/>
-        </w:rPr>
+        <w:t>Esta fue la decisión más difícil de todo el diseño, y donde más cambié de opinión.</w:t>
+      </w:r>
+      <w:r>
         <w:br/>
-      </w:r>
-      <w:r>
-        <w:rPr>
-          <w:i/>
-          <w:iCs/>
-        </w:rPr>
-        <w:t xml:space="preserve"> </w:t>
-      </w:r>
-      <w:r>
-        <w:rPr>
-          <w:i/>
-          <w:iCs/>
-        </w:rPr>
-        <w:t>- No</w:t>
-      </w:r>
-      <w:r>
-        <w:rPr>
-          <w:i/>
-          <w:iCs/>
-        </w:rPr>
-        <w:t xml:space="preserve"> multiplic</w:t>
-      </w:r>
-      <w:r>
-        <w:rPr>
-          <w:i/>
-          <w:iCs/>
-        </w:rPr>
-        <w:t>o</w:t>
-      </w:r>
-      <w:r>
-        <w:rPr>
-          <w:i/>
-          <w:iCs/>
-        </w:rPr>
-        <w:t xml:space="preserve"> solo por 0.</w:t>
-      </w:r>
-      <w:r>
-        <w:rPr>
-          <w:i/>
-          <w:iCs/>
-        </w:rPr>
-        <w:t xml:space="preserve">1 </w:t>
-      </w:r>
-      <w:r>
-        <w:rPr>
-          <w:i/>
-          <w:iCs/>
-        </w:rPr>
-        <w:t xml:space="preserve">0 (eso </w:t>
-      </w:r>
-      <w:r>
-        <w:rPr>
-          <w:i/>
-          <w:iCs/>
-        </w:rPr>
-        <w:t>m</w:t>
-      </w:r>
-      <w:r>
-        <w:rPr>
-          <w:i/>
-          <w:iCs/>
-        </w:rPr>
-        <w:t>e daría</w:t>
-      </w:r>
-      <w:r>
-        <w:rPr>
-          <w:i/>
-          <w:iCs/>
-        </w:rPr>
-        <w:t xml:space="preserve"> como resultado</w:t>
-      </w:r>
-      <w:r>
-        <w:rPr>
-          <w:i/>
-          <w:iCs/>
-        </w:rPr>
-        <w:t xml:space="preserve"> solamente el </w:t>
-      </w:r>
-      <w:r>
-        <w:rPr>
-          <w:i/>
-          <w:iCs/>
-        </w:rPr>
-        <w:t>1</w:t>
-      </w:r>
-      <w:r>
-        <w:rPr>
-          <w:i/>
-          <w:iCs/>
-        </w:rPr>
-        <w:t xml:space="preserve">0% extra, no el total). </w:t>
-      </w:r>
-      <w:r>
-        <w:rPr>
-          <w:i/>
-          <w:iCs/>
-        </w:rPr>
-        <w:t xml:space="preserve">Entonces multiplico * </w:t>
-      </w:r>
-      <w:r>
-        <w:rPr>
-          <w:i/>
-          <w:iCs/>
-        </w:rPr>
-        <w:t xml:space="preserve">1.10, porque </w:t>
-      </w:r>
-      <w:r>
-        <w:rPr>
-          <w:i/>
-          <w:iCs/>
-        </w:rPr>
-        <w:t>necesito</w:t>
-      </w:r>
-      <w:r>
-        <w:rPr>
-          <w:i/>
-          <w:iCs/>
-        </w:rPr>
-        <w:t xml:space="preserve"> el 100% original </w:t>
-      </w:r>
-      <w:r>
-        <w:rPr>
-          <w:rStyle w:val="Textoennegrita"/>
-          <w:i/>
-          <w:iCs/>
-        </w:rPr>
-        <w:t>más</w:t>
-      </w:r>
-      <w:r>
-        <w:rPr>
-          <w:i/>
-          <w:iCs/>
-        </w:rPr>
-        <w:t xml:space="preserve"> el </w:t>
-      </w:r>
-      <w:r>
-        <w:rPr>
-          <w:i/>
-          <w:iCs/>
-        </w:rPr>
-        <w:t>1</w:t>
-      </w:r>
-      <w:r>
-        <w:rPr>
-          <w:i/>
-          <w:iCs/>
-        </w:rPr>
-        <w:t>0% adicional</w:t>
+        <w:t xml:space="preserve">una de mis primeras opciones </w:t>
+      </w:r>
+      <w:r>
+        <w:t>fue ubicar el MDF en el hall central, por ser el punto</w:t>
+      </w:r>
+      <w:r>
+        <w:t xml:space="preserve"> más central del plano</w:t>
+      </w:r>
+      <w:r>
+        <w:t>. Sin embargo, al analizarlo con más profundidad, identifiqué varios problemas: el hall es una zona de tránsito constante, sin condiciones ambientales controladas, y exponer ahí el switch principal, el patch panel y el UPS representaba un riesgo de seguridad física real.</w:t>
+      </w:r>
+    </w:p>
+    <w:p>
+      <w:pPr>
+        <w:spacing w:after="200" w:line="300" w:lineRule="auto"/>
+        <w:jc w:val="both"/>
+      </w:pPr>
+      <w:r>
+        <w:t>E</w:t>
+      </w:r>
+      <w:r>
+        <w:t xml:space="preserve">ntonces </w:t>
+      </w:r>
+      <w:r>
+        <w:t xml:space="preserve">consideré </w:t>
+      </w:r>
+      <w:r>
+        <w:t xml:space="preserve">ubicar el MDF dentro del Data Center, aprovechando que ya es un espacio cerrado, de acceso restringido y donde ya residen los 3 servidores principales de la empresa. Esto significó aceptar un incremento en la distancia promedio de cableado troncal frente al hall central, pero decidí priorizar la seguridad y el control ambiental sobre la mínima distancia geométrica, ya que el sobrecosto en metros de cable resultó </w:t>
+      </w:r>
+      <w:r>
+        <w:t>poco</w:t>
+      </w:r>
+      <w:r>
+        <w:t xml:space="preserve"> frente al beneficio de proteger el equipo activo.</w:t>
+      </w:r>
+    </w:p>
+    <w:p>
+      <w:pPr>
+        <w:spacing w:after="200" w:line="300" w:lineRule="auto"/>
+        <w:jc w:val="both"/>
+      </w:pPr>
+      <w:r>
+        <w:t>Un reto adicional fue definir el punto exacto dentro del Data Center: inicialmente consideré el fondo del cuarto, pero terminé ubicándolo en la esquina más cercana al resto del edificio (colindante con Diseño e Innovación y Dirección General), para minimizar la distancia dentro de las limitaciones de la ubicación elegida.</w:t>
+      </w:r>
+    </w:p>
+    <w:p>
+      <w:pPr>
+        <w:spacing w:after="200" w:line="300" w:lineRule="auto"/>
+        <w:jc w:val="both"/>
+      </w:pPr>
+      <w:r>
+        <w:t>Para estimar las distancias, tuve que interiorizar que un cable no puede recorrer una línea recta diagonal</w:t>
+      </w:r>
+      <w:r>
+        <w:t>.</w:t>
+      </w:r>
+      <w:r>
+        <w:br/>
+        <w:t>D</w:t>
+      </w:r>
+      <w:r>
+        <w:t>ebe seguir un camino ortogonal (en “L”), igual que caminar por los pasillos de un edificio en lugar de cruzar en diagonal. Con esto, medí para cada switch de departamento la distancia horizontal y vertical desde el MDF, sumándolas, y agregando un 10% de holgura para cubrir curvas, bajadas de techo a pared y reserva de servicio en los extremos.</w:t>
+      </w:r>
+    </w:p>
+    <w:p>
+      <w:pPr>
+        <w:spacing w:after="200" w:line="300" w:lineRule="auto"/>
+        <w:jc w:val="both"/>
+      </w:pPr>
+      <w:r>
+        <w:t>Con la suma total del cableado troncal (111.1 m) más el cableado horizontal, que estimé usando un método de aproximación, llegué a un total combinado de 493.9 m. Como ambos tipos de cableado usan la misma categoría de cable (UTP Cat6), decidí calcular las bobinas necesarias de forma conjunta en lugar de por separado, lo cual optimiza la compra de materiales: el resultado fueron 2 bobinas de 305 m, con una reserva razonable de aproximadamente 116 m para imprevistos.</w:t>
       </w:r>
     </w:p>
     <w:p>
@@ -7109,74 +6038,9 @@
           <w:shd w:val="clear" w:color="auto" w:fill="FFFFFF"/>
         </w:rPr>
       </w:pPr>
-      <w:r>
-        <w:rPr>
-          <w:rFonts w:cstheme="minorHAnsi"/>
-          <w:b/>
-          <w:bCs/>
-          <w:noProof/>
-          <w:color w:val="000000" w:themeColor="text1"/>
-          <w:sz w:val="21"/>
-          <w:szCs w:val="21"/>
-          <w:shd w:val="clear" w:color="auto" w:fill="FFFFFF"/>
-        </w:rPr>
-        <w:drawing>
-          <wp:anchor distT="0" distB="0" distL="114300" distR="114300" simplePos="0" relativeHeight="251658240" behindDoc="0" locked="0" layoutInCell="1" allowOverlap="1" wp14:anchorId="1C5F40DF" wp14:editId="77754A88">
-            <wp:simplePos x="0" y="0"/>
-            <wp:positionH relativeFrom="margin">
-              <wp:align>center</wp:align>
-            </wp:positionH>
-            <wp:positionV relativeFrom="paragraph">
-              <wp:posOffset>275339</wp:posOffset>
-            </wp:positionV>
-            <wp:extent cx="7076440" cy="4901565"/>
-            <wp:effectExtent l="0" t="0" r="0" b="0"/>
-            <wp:wrapSquare wrapText="bothSides"/>
-            <wp:docPr id="1" name="Imagen 1"/>
-            <wp:cNvGraphicFramePr>
-              <a:graphicFrameLocks xmlns:a="http://schemas.openxmlformats.org/drawingml/2006/main" noChangeAspect="1"/>
-            </wp:cNvGraphicFramePr>
-            <a:graphic xmlns:a="http://schemas.openxmlformats.org/drawingml/2006/main">
-              <a:graphicData uri="http://schemas.openxmlformats.org/drawingml/2006/picture">
-                <pic:pic xmlns:pic="http://schemas.openxmlformats.org/drawingml/2006/picture">
-                  <pic:nvPicPr>
-                    <pic:cNvPr id="1" name="Imagen 1"/>
-                    <pic:cNvPicPr/>
-                  </pic:nvPicPr>
-                  <pic:blipFill>
-                    <a:blip r:embed="rId7" cstate="print">
-                      <a:extLst>
-                        <a:ext uri="{28A0092B-C50C-407E-A947-70E740481C1C}">
-                          <a14:useLocalDpi xmlns:a14="http://schemas.microsoft.com/office/drawing/2010/main" val="0"/>
-                        </a:ext>
-                      </a:extLst>
-                    </a:blip>
-                    <a:stretch>
-                      <a:fillRect/>
-                    </a:stretch>
-                  </pic:blipFill>
-                  <pic:spPr>
-                    <a:xfrm>
-                      <a:off x="0" y="0"/>
-                      <a:ext cx="7076440" cy="4901565"/>
-                    </a:xfrm>
-                    <a:prstGeom prst="rect">
-                      <a:avLst/>
-                    </a:prstGeom>
-                  </pic:spPr>
-                </pic:pic>
-              </a:graphicData>
-            </a:graphic>
-            <wp14:sizeRelH relativeFrom="page">
-              <wp14:pctWidth>0</wp14:pctWidth>
-            </wp14:sizeRelH>
-            <wp14:sizeRelV relativeFrom="page">
-              <wp14:pctHeight>0</wp14:pctHeight>
-            </wp14:sizeRelV>
-          </wp:anchor>
-        </w:drawing>
-      </w:r>
-      <w:r>
+    </w:p>
+    <w:p>
+      <w:pPr>
         <w:rPr>
           <w:rFonts w:cstheme="minorHAnsi"/>
           <w:b/>
@@ -7186,8 +6050,7 @@
           <w:szCs w:val="21"/>
           <w:shd w:val="clear" w:color="auto" w:fill="FFFFFF"/>
         </w:rPr>
-        <w:br w:type="page"/>
-      </w:r>
+      </w:pPr>
     </w:p>
     <w:p>
       <w:pPr>
@@ -7201,7 +6064,9 @@
           <w:shd w:val="clear" w:color="auto" w:fill="FFFFFF"/>
         </w:rPr>
       </w:pPr>
-      <w:r>
+    </w:p>
+    <w:p>
+      <w:pPr>
         <w:rPr>
           <w:rFonts w:cstheme="minorHAnsi"/>
           <w:b/>
@@ -7211,7 +6076,29 @@
           <w:szCs w:val="21"/>
           <w:shd w:val="clear" w:color="auto" w:fill="FFFFFF"/>
         </w:rPr>
-        <w:lastRenderedPageBreak/>
+      </w:pPr>
+      <w:r>
+        <w:rPr>
+          <w:rFonts w:cstheme="minorHAnsi"/>
+          <w:b/>
+          <w:bCs/>
+          <w:color w:val="000000" w:themeColor="text1"/>
+          <w:sz w:val="21"/>
+          <w:szCs w:val="21"/>
+          <w:shd w:val="clear" w:color="auto" w:fill="FFFFFF"/>
+        </w:rPr>
+        <w:t xml:space="preserve"> </w:t>
+      </w:r>
+      <w:r>
+        <w:rPr>
+          <w:rFonts w:cstheme="minorHAnsi"/>
+          <w:b/>
+          <w:bCs/>
+          <w:color w:val="000000" w:themeColor="text1"/>
+          <w:sz w:val="21"/>
+          <w:szCs w:val="21"/>
+          <w:shd w:val="clear" w:color="auto" w:fill="FFFFFF"/>
+        </w:rPr>
         <w:t>4. Elegir Medios de trasmisión y categoría de cable.</w:t>
       </w:r>
     </w:p>
@@ -7220,40 +6107,23 @@
         <w:pStyle w:val="NormalWeb"/>
       </w:pPr>
       <w:r>
+        <w:t>C</w:t>
+      </w:r>
+      <w:r>
+        <w:t xml:space="preserve">able de cobre </w:t>
+      </w:r>
+      <w:r>
         <w:rPr>
           <w:rStyle w:val="Textoennegrita"/>
         </w:rPr>
-        <w:t>Tipo de medio:</w:t>
-      </w:r>
-      <w:r>
-        <w:t xml:space="preserve"> Se utiliza cable de cobre </w:t>
-      </w:r>
-      <w:r>
-        <w:rPr>
-          <w:rStyle w:val="Textoennegrita"/>
-        </w:rPr>
         <w:t>UTP</w:t>
       </w:r>
       <w:r>
-        <w:t xml:space="preserve"> en la totalidad del edificio (troncal y horizontal). No se emplea fibra óptica, ya que las distancias máximas registradas en el diseño</w:t>
-      </w:r>
-      <w:r>
-        <w:t xml:space="preserve"> son menores de 30 metros. </w:t>
-      </w:r>
-      <w:r>
-        <w:t xml:space="preserve">están muy por debajo del límite de 100 m que soporta el cableado de cobre según el estándar TIA/EIA-568, </w:t>
+        <w:t xml:space="preserve"> en la totalidad del edificio (troncal y horizontal). No se emplea fibra óptica, ya que las distancias máximas registradas en el diseño son menores de 30 metros. están muy por debajo del límite de 100 m que soporta el cableado de cobre según el estándar TIA/EIA-568, </w:t>
       </w:r>
       <w:r>
         <w:br/>
-      </w:r>
-      <w:r>
-        <w:t xml:space="preserve">por lo que el uso de fibra </w:t>
-      </w:r>
-      <w:r>
-        <w:t>significaría</w:t>
-      </w:r>
-      <w:r>
-        <w:t xml:space="preserve"> un sobrecosto injustificado para las necesidades del edificio.</w:t>
+        <w:t>por lo que el uso de fibra significaría un sobrecosto injustificado para las necesidades del edificio.</w:t>
       </w:r>
     </w:p>
     <w:p>
@@ -7261,16 +6131,7 @@
         <w:pStyle w:val="NormalWeb"/>
       </w:pPr>
       <w:r>
-        <w:rPr>
-          <w:rStyle w:val="Textoennegrita"/>
-        </w:rPr>
-        <w:t>Categoría de cable:</w:t>
-      </w:r>
-      <w:r>
-        <w:t xml:space="preserve"> Se</w:t>
-      </w:r>
-      <w:r>
-        <w:t xml:space="preserve">leccioné </w:t>
+        <w:t xml:space="preserve"> Seleccioné </w:t>
       </w:r>
       <w:r>
         <w:rPr>
@@ -7291,13 +6152,7 @@
         <w:spacing w:before="100" w:beforeAutospacing="1" w:after="100" w:afterAutospacing="1" w:line="240" w:lineRule="auto"/>
       </w:pPr>
       <w:r>
-        <w:t xml:space="preserve">Soporta velocidades de hasta 10 Gbps a distancias de hasta ~55 m, y hasta 1 Gbps a los 100 m completos </w:t>
-      </w:r>
-      <w:r>
-        <w:t xml:space="preserve">esto es más que </w:t>
-      </w:r>
-      <w:r>
-        <w:t>suficiente para las distancias del diseño.</w:t>
+        <w:t>Soporta velocidades de hasta 10 Gbps a distancias de hasta ~55 m, y hasta 1 Gbps a los 100 m completos esto es más que suficiente para las distancias del diseño.</w:t>
       </w:r>
     </w:p>
     <w:p>
@@ -7321,10 +6176,7 @@
         <w:spacing w:before="100" w:beforeAutospacing="1" w:after="100" w:afterAutospacing="1" w:line="240" w:lineRule="auto"/>
       </w:pPr>
       <w:r>
-        <w:t>Deja margen de crecimiento a futuro sin necesidad de recablear, en caso de actualizar el equipo</w:t>
-      </w:r>
-      <w:r>
-        <w:t>.</w:t>
+        <w:t>Deja margen de crecimiento a futuro sin necesidad de recablear, en caso de actualizar el equipo.</w:t>
       </w:r>
     </w:p>
     <w:tbl>
@@ -7498,23 +6350,7 @@
                 <w:rStyle w:val="CdigoHTML"/>
                 <w:rFonts w:asciiTheme="minorHAnsi" w:hAnsiTheme="minorHAnsi" w:cstheme="minorHAnsi"/>
               </w:rPr>
-              <w:t xml:space="preserve">las Distancias son menores que 30 metros (≤ 30 m), compatible con </w:t>
-            </w:r>
-            <w:proofErr w:type="spellStart"/>
-            <w:r>
-              <w:rPr>
-                <w:rStyle w:val="CdigoHTML"/>
-                <w:rFonts w:asciiTheme="minorHAnsi" w:hAnsiTheme="minorHAnsi" w:cstheme="minorHAnsi"/>
-              </w:rPr>
-              <w:t>uplink</w:t>
-            </w:r>
-            <w:proofErr w:type="spellEnd"/>
-            <w:r>
-              <w:rPr>
-                <w:rStyle w:val="CdigoHTML"/>
-                <w:rFonts w:asciiTheme="minorHAnsi" w:hAnsiTheme="minorHAnsi" w:cstheme="minorHAnsi"/>
-              </w:rPr>
-              <w:t xml:space="preserve"> Gigabit</w:t>
+              <w:t>las Distancias son menores que 30 metros (≤ 30 m), compatible con uplink Gigabit</w:t>
             </w:r>
           </w:p>
         </w:tc>
@@ -7684,7 +6520,6 @@
                 <w:tab w:val="left" w:pos="13740"/>
                 <w:tab w:val="left" w:pos="14656"/>
               </w:tabs>
-              <w:spacing w:after="0" w:line="240" w:lineRule="auto"/>
               <w:rPr>
                 <w:rFonts w:eastAsia="Times New Roman" w:cstheme="minorHAnsi"/>
                 <w:sz w:val="20"/>
@@ -7721,9 +6556,62 @@
     <w:p>
       <w:pPr>
         <w:spacing w:before="100" w:beforeAutospacing="1" w:after="100" w:afterAutospacing="1" w:line="240" w:lineRule="auto"/>
-      </w:pPr>
-    </w:p>
-    <w:p/>
+        <w:rPr>
+          <w:b/>
+          <w:bCs/>
+        </w:rPr>
+      </w:pPr>
+    </w:p>
+    <w:p>
+      <w:pPr>
+        <w:spacing w:before="100" w:beforeAutospacing="1" w:after="100" w:afterAutospacing="1" w:line="240" w:lineRule="auto"/>
+        <w:rPr>
+          <w:b/>
+          <w:bCs/>
+        </w:rPr>
+      </w:pPr>
+      <w:r>
+        <w:rPr>
+          <w:b/>
+          <w:bCs/>
+        </w:rPr>
+        <w:t xml:space="preserve">5. </w:t>
+      </w:r>
+      <w:r>
+        <w:rPr>
+          <w:b/>
+          <w:bCs/>
+        </w:rPr>
+        <w:t>DIMENSION DE EQUIPO ACTIVO</w:t>
+      </w:r>
+    </w:p>
+    <w:p>
+      <w:pPr>
+        <w:spacing w:after="200" w:line="300" w:lineRule="auto"/>
+        <w:jc w:val="both"/>
+      </w:pPr>
+      <w:r>
+        <w:t>Algo importante</w:t>
+      </w:r>
+      <w:r>
+        <w:t xml:space="preserve"> en esta etapa fue recordar que cada switch de departamento necesita un puerto adicional dedicado al enlace troncal (uplink) hacia el MDF, además de los puertos para sus </w:t>
+      </w:r>
+      <w:r>
+        <w:t>hosts inicialmente</w:t>
+      </w:r>
+      <w:r>
+        <w:t xml:space="preserve"> no lo había contemplado, y tuve que revisar y ajustar el dimensionamiento de varios switches una vez lo identifiqué. Con ese ajuste, distribuí los switches departamentales entre modelos de 8 y 16 puertos según la cantidad real de hosts de cada área, evitando sobredimensionar innecesariamente (y su respectivo sobrecosto) en departamentos pequeños.</w:t>
+      </w:r>
+    </w:p>
+    <w:p>
+      <w:pPr>
+        <w:spacing w:after="200" w:line="300" w:lineRule="auto"/>
+        <w:jc w:val="both"/>
+      </w:pPr>
+      <w:r>
+        <w:t>Para el patch panel y el switch principal del MDF, el criterio fue directo: dimensionarlos según el total de 48 puntos de red del edificio, resultando en un tamaño exacto sin puertos de reserva adicionales, priorizando la solución más económica para el alcance actual del proyecto.</w:t>
+      </w:r>
+    </w:p>
     <w:p>
       <w:pPr>
         <w:rPr>
@@ -7752,6 +6640,140 @@
     </w:p>
     <w:p>
       <w:pPr>
+        <w:pStyle w:val="Ttulo1"/>
+        <w:spacing w:before="320" w:after="160"/>
+        <w:rPr>
+          <w:b/>
+          <w:bCs/>
+          <w:color w:val="000000" w:themeColor="text1"/>
+        </w:rPr>
+      </w:pPr>
+    </w:p>
+    <w:p>
+      <w:pPr>
+        <w:pStyle w:val="Ttulo1"/>
+        <w:spacing w:before="320" w:after="160"/>
+        <w:rPr>
+          <w:b/>
+          <w:bCs/>
+          <w:color w:val="000000" w:themeColor="text1"/>
+        </w:rPr>
+      </w:pPr>
+    </w:p>
+    <w:p>
+      <w:pPr>
+        <w:pStyle w:val="Ttulo1"/>
+        <w:spacing w:before="320" w:after="160"/>
+        <w:rPr>
+          <w:b/>
+          <w:bCs/>
+          <w:color w:val="000000" w:themeColor="text1"/>
+        </w:rPr>
+      </w:pPr>
+    </w:p>
+    <w:p>
+      <w:pPr>
+        <w:pStyle w:val="Ttulo1"/>
+        <w:spacing w:before="320" w:after="160"/>
+        <w:rPr>
+          <w:b/>
+          <w:bCs/>
+          <w:color w:val="000000" w:themeColor="text1"/>
+        </w:rPr>
+      </w:pPr>
+    </w:p>
+    <w:p>
+      <w:pPr>
+        <w:pStyle w:val="Ttulo1"/>
+        <w:spacing w:before="320" w:after="160"/>
+        <w:rPr>
+          <w:b/>
+          <w:bCs/>
+          <w:color w:val="000000" w:themeColor="text1"/>
+        </w:rPr>
+      </w:pPr>
+      <w:r>
+        <w:rPr>
+          <w:b/>
+          <w:bCs/>
+          <w:color w:val="000000" w:themeColor="text1"/>
+        </w:rPr>
+        <w:t xml:space="preserve">6. </w:t>
+      </w:r>
+      <w:r>
+        <w:rPr>
+          <w:b/>
+          <w:bCs/>
+          <w:color w:val="000000" w:themeColor="text1"/>
+        </w:rPr>
+        <w:t>Straight-through, crossover y disposición de pines</w:t>
+      </w:r>
+    </w:p>
+    <w:p>
+      <w:pPr>
+        <w:spacing w:after="200" w:line="300" w:lineRule="auto"/>
+        <w:jc w:val="both"/>
+        <w:rPr>
+          <w:color w:val="000000" w:themeColor="text1"/>
+        </w:rPr>
+      </w:pPr>
+      <w:r>
+        <w:t>Apliqué la regla de que dispositivos de distinto tipo (hosts, patch panel) se conectan con cable straight-through, mientras que dispositivos del mismo tipo (switch a switch) requieren crossover para invertir los pares de transmisión y recepción</w:t>
+      </w:r>
+    </w:p>
+    <w:p>
+      <w:pPr>
+        <w:pStyle w:val="Ttulo1"/>
+        <w:spacing w:before="320" w:after="160"/>
+        <w:rPr>
+          <w:b/>
+          <w:bCs/>
+          <w:color w:val="000000" w:themeColor="text1"/>
+        </w:rPr>
+      </w:pPr>
+      <w:r>
+        <w:rPr>
+          <w:b/>
+          <w:bCs/>
+          <w:color w:val="000000" w:themeColor="text1"/>
+        </w:rPr>
+        <w:t xml:space="preserve">7. </w:t>
+      </w:r>
+      <w:r>
+        <w:rPr>
+          <w:b/>
+          <w:bCs/>
+          <w:color w:val="000000" w:themeColor="text1"/>
+        </w:rPr>
+        <w:t>Canalización, rack y respaldo eléctrico</w:t>
+      </w:r>
+    </w:p>
+    <w:p>
+      <w:pPr>
+        <w:spacing w:after="200" w:line="300" w:lineRule="auto"/>
+        <w:jc w:val="both"/>
+      </w:pPr>
+      <w:r>
+        <w:t>Para el cableado troncal elegí escalerilla metálica cerrada, priorizando la protección de los 8 enlaces que atraviesan el hall central (zona de tránsito), mientras que para el cableado horizontal dentro de cada oficina opté por canaleta de PVC superficial, más económica y discreta para tramos cortos. Para el MDF, descarté un gabinete de pared una vez calculé el espacio real necesario (entre 10 y 14U considerando patch panel, switch principal, switch de Data Center, servidores y UPS), optando por un rack de piso de 24U que deja margen de crecimiento futuro.</w:t>
+      </w:r>
+    </w:p>
+    <w:p>
+      <w:pPr>
+        <w:spacing w:after="200" w:line="300" w:lineRule="auto"/>
+        <w:jc w:val="both"/>
+      </w:pPr>
+      <w:r>
+        <w:t>Para el UPS, calculé por separado el consumo del equipo de red y el de los servidores principales, dado que estos últimos representan una carga considerablemente mayor y más crítica. Finalmente, opté por consolidar ambas cargas en un único UPS de 3,000 VA, simplificando la gestión del respaldo eléctrico del cuarto de telecomunicaciones.</w:t>
+      </w:r>
+    </w:p>
+    <w:p>
+      <w:pPr>
+        <w:spacing w:after="200" w:line="300" w:lineRule="auto"/>
+        <w:jc w:val="both"/>
+      </w:pPr>
+    </w:p>
+    <w:p>
+      <w:pPr>
         <w:rPr>
           <w:rFonts w:cstheme="minorHAnsi"/>
           <w:b/>
@@ -7791,6 +6813,25 @@
     </w:p>
     <w:p>
       <w:pPr>
+        <w:pStyle w:val="NormalWeb"/>
+      </w:pPr>
+      <w:r>
+        <w:br/>
+      </w:r>
+      <w:r>
+        <w:br/>
+      </w:r>
+      <w:r>
+        <w:br/>
+      </w:r>
+    </w:p>
+    <w:p>
+      <w:pPr>
+        <w:pStyle w:val="NormalWeb"/>
+      </w:pPr>
+    </w:p>
+    <w:p>
+      <w:pPr>
         <w:rPr>
           <w:rFonts w:cstheme="minorHAnsi"/>
           <w:b/>
@@ -7802,61 +6843,10 @@
         </w:rPr>
       </w:pPr>
     </w:p>
-    <w:p>
-      <w:pPr>
-        <w:rPr>
-          <w:rFonts w:cstheme="minorHAnsi"/>
-          <w:b/>
-          <w:bCs/>
-          <w:color w:val="000000" w:themeColor="text1"/>
-          <w:sz w:val="21"/>
-          <w:szCs w:val="21"/>
-          <w:shd w:val="clear" w:color="auto" w:fill="FFFFFF"/>
-        </w:rPr>
-      </w:pPr>
-    </w:p>
-    <w:p>
-      <w:pPr>
-        <w:rPr>
-          <w:rFonts w:cstheme="minorHAnsi"/>
-          <w:b/>
-          <w:bCs/>
-          <w:color w:val="000000" w:themeColor="text1"/>
-          <w:sz w:val="21"/>
-          <w:szCs w:val="21"/>
-          <w:shd w:val="clear" w:color="auto" w:fill="FFFFFF"/>
-        </w:rPr>
-      </w:pPr>
-    </w:p>
-    <w:p>
-      <w:pPr>
-        <w:rPr>
-          <w:rFonts w:cstheme="minorHAnsi"/>
-          <w:b/>
-          <w:bCs/>
-          <w:color w:val="000000" w:themeColor="text1"/>
-          <w:sz w:val="21"/>
-          <w:szCs w:val="21"/>
-          <w:shd w:val="clear" w:color="auto" w:fill="FFFFFF"/>
-        </w:rPr>
-      </w:pPr>
-    </w:p>
-    <w:p>
-      <w:pPr>
-        <w:rPr>
-          <w:rFonts w:cstheme="minorHAnsi"/>
-          <w:b/>
-          <w:bCs/>
-          <w:color w:val="000000" w:themeColor="text1"/>
-          <w:sz w:val="21"/>
-          <w:szCs w:val="21"/>
-          <w:shd w:val="clear" w:color="auto" w:fill="FFFFFF"/>
-        </w:rPr>
-      </w:pPr>
-    </w:p>
     <w:sectPr>
+      <w:type w:val="continuous"/>
       <w:pgSz w:w="12240" w:h="15840"/>
-      <w:pgMar w:top="851" w:right="1701" w:bottom="567" w:left="1701" w:header="708" w:footer="708" w:gutter="0"/>
+      <w:pgMar w:top="851" w:right="1701" w:bottom="284" w:left="1701" w:header="708" w:footer="708" w:gutter="0"/>
       <w:cols w:space="708"/>
       <w:docGrid w:linePitch="360"/>
     </w:sectPr>
@@ -8066,9 +7056,9 @@
     </w:lvl>
   </w:abstractNum>
   <w:abstractNum w:abstractNumId="1" w15:restartNumberingAfterBreak="0">
-    <w:nsid w:val="4A32297F"/>
+    <w:nsid w:val="26D02A71"/>
     <w:multiLevelType w:val="multilevel"/>
-    <w:tmpl w:val="2C24EC5E"/>
+    <w:tmpl w:val="DBE0C7E8"/>
     <w:lvl w:ilvl="0">
       <w:start w:val="1"/>
       <w:numFmt w:val="bullet"/>
@@ -8214,11 +7204,467 @@
       </w:rPr>
     </w:lvl>
   </w:abstractNum>
+  <w:abstractNum w:abstractNumId="2" w15:restartNumberingAfterBreak="0">
+    <w:nsid w:val="2EE5490C"/>
+    <w:multiLevelType w:val="multilevel"/>
+    <w:tmpl w:val="499C6B68"/>
+    <w:lvl w:ilvl="0">
+      <w:start w:val="1"/>
+      <w:numFmt w:val="bullet"/>
+      <w:lvlText w:val=""/>
+      <w:lvlJc w:val="left"/>
+      <w:pPr>
+        <w:tabs>
+          <w:tab w:val="num" w:pos="720"/>
+        </w:tabs>
+        <w:ind w:left="720" w:hanging="360"/>
+      </w:pPr>
+      <w:rPr>
+        <w:rFonts w:ascii="Symbol" w:hAnsi="Symbol" w:hint="default"/>
+        <w:sz w:val="20"/>
+      </w:rPr>
+    </w:lvl>
+    <w:lvl w:ilvl="1" w:tentative="1">
+      <w:start w:val="1"/>
+      <w:numFmt w:val="bullet"/>
+      <w:lvlText w:val="o"/>
+      <w:lvlJc w:val="left"/>
+      <w:pPr>
+        <w:tabs>
+          <w:tab w:val="num" w:pos="1440"/>
+        </w:tabs>
+        <w:ind w:left="1440" w:hanging="360"/>
+      </w:pPr>
+      <w:rPr>
+        <w:rFonts w:ascii="Courier New" w:hAnsi="Courier New" w:hint="default"/>
+        <w:sz w:val="20"/>
+      </w:rPr>
+    </w:lvl>
+    <w:lvl w:ilvl="2" w:tentative="1">
+      <w:start w:val="1"/>
+      <w:numFmt w:val="bullet"/>
+      <w:lvlText w:val=""/>
+      <w:lvlJc w:val="left"/>
+      <w:pPr>
+        <w:tabs>
+          <w:tab w:val="num" w:pos="2160"/>
+        </w:tabs>
+        <w:ind w:left="2160" w:hanging="360"/>
+      </w:pPr>
+      <w:rPr>
+        <w:rFonts w:ascii="Wingdings" w:hAnsi="Wingdings" w:hint="default"/>
+        <w:sz w:val="20"/>
+      </w:rPr>
+    </w:lvl>
+    <w:lvl w:ilvl="3" w:tentative="1">
+      <w:start w:val="1"/>
+      <w:numFmt w:val="bullet"/>
+      <w:lvlText w:val=""/>
+      <w:lvlJc w:val="left"/>
+      <w:pPr>
+        <w:tabs>
+          <w:tab w:val="num" w:pos="2880"/>
+        </w:tabs>
+        <w:ind w:left="2880" w:hanging="360"/>
+      </w:pPr>
+      <w:rPr>
+        <w:rFonts w:ascii="Wingdings" w:hAnsi="Wingdings" w:hint="default"/>
+        <w:sz w:val="20"/>
+      </w:rPr>
+    </w:lvl>
+    <w:lvl w:ilvl="4" w:tentative="1">
+      <w:start w:val="1"/>
+      <w:numFmt w:val="bullet"/>
+      <w:lvlText w:val=""/>
+      <w:lvlJc w:val="left"/>
+      <w:pPr>
+        <w:tabs>
+          <w:tab w:val="num" w:pos="3600"/>
+        </w:tabs>
+        <w:ind w:left="3600" w:hanging="360"/>
+      </w:pPr>
+      <w:rPr>
+        <w:rFonts w:ascii="Wingdings" w:hAnsi="Wingdings" w:hint="default"/>
+        <w:sz w:val="20"/>
+      </w:rPr>
+    </w:lvl>
+    <w:lvl w:ilvl="5" w:tentative="1">
+      <w:start w:val="1"/>
+      <w:numFmt w:val="bullet"/>
+      <w:lvlText w:val=""/>
+      <w:lvlJc w:val="left"/>
+      <w:pPr>
+        <w:tabs>
+          <w:tab w:val="num" w:pos="4320"/>
+        </w:tabs>
+        <w:ind w:left="4320" w:hanging="360"/>
+      </w:pPr>
+      <w:rPr>
+        <w:rFonts w:ascii="Wingdings" w:hAnsi="Wingdings" w:hint="default"/>
+        <w:sz w:val="20"/>
+      </w:rPr>
+    </w:lvl>
+    <w:lvl w:ilvl="6" w:tentative="1">
+      <w:start w:val="1"/>
+      <w:numFmt w:val="bullet"/>
+      <w:lvlText w:val=""/>
+      <w:lvlJc w:val="left"/>
+      <w:pPr>
+        <w:tabs>
+          <w:tab w:val="num" w:pos="5040"/>
+        </w:tabs>
+        <w:ind w:left="5040" w:hanging="360"/>
+      </w:pPr>
+      <w:rPr>
+        <w:rFonts w:ascii="Wingdings" w:hAnsi="Wingdings" w:hint="default"/>
+        <w:sz w:val="20"/>
+      </w:rPr>
+    </w:lvl>
+    <w:lvl w:ilvl="7" w:tentative="1">
+      <w:start w:val="1"/>
+      <w:numFmt w:val="bullet"/>
+      <w:lvlText w:val=""/>
+      <w:lvlJc w:val="left"/>
+      <w:pPr>
+        <w:tabs>
+          <w:tab w:val="num" w:pos="5760"/>
+        </w:tabs>
+        <w:ind w:left="5760" w:hanging="360"/>
+      </w:pPr>
+      <w:rPr>
+        <w:rFonts w:ascii="Wingdings" w:hAnsi="Wingdings" w:hint="default"/>
+        <w:sz w:val="20"/>
+      </w:rPr>
+    </w:lvl>
+    <w:lvl w:ilvl="8" w:tentative="1">
+      <w:start w:val="1"/>
+      <w:numFmt w:val="bullet"/>
+      <w:lvlText w:val=""/>
+      <w:lvlJc w:val="left"/>
+      <w:pPr>
+        <w:tabs>
+          <w:tab w:val="num" w:pos="6480"/>
+        </w:tabs>
+        <w:ind w:left="6480" w:hanging="360"/>
+      </w:pPr>
+      <w:rPr>
+        <w:rFonts w:ascii="Wingdings" w:hAnsi="Wingdings" w:hint="default"/>
+        <w:sz w:val="20"/>
+      </w:rPr>
+    </w:lvl>
+  </w:abstractNum>
+  <w:abstractNum w:abstractNumId="3" w15:restartNumberingAfterBreak="0">
+    <w:nsid w:val="4A32297F"/>
+    <w:multiLevelType w:val="multilevel"/>
+    <w:tmpl w:val="2C24EC5E"/>
+    <w:lvl w:ilvl="0">
+      <w:start w:val="1"/>
+      <w:numFmt w:val="bullet"/>
+      <w:lvlText w:val=""/>
+      <w:lvlJc w:val="left"/>
+      <w:pPr>
+        <w:tabs>
+          <w:tab w:val="num" w:pos="720"/>
+        </w:tabs>
+        <w:ind w:left="720" w:hanging="360"/>
+      </w:pPr>
+      <w:rPr>
+        <w:rFonts w:ascii="Symbol" w:hAnsi="Symbol" w:hint="default"/>
+        <w:sz w:val="20"/>
+      </w:rPr>
+    </w:lvl>
+    <w:lvl w:ilvl="1" w:tentative="1">
+      <w:start w:val="1"/>
+      <w:numFmt w:val="bullet"/>
+      <w:lvlText w:val="o"/>
+      <w:lvlJc w:val="left"/>
+      <w:pPr>
+        <w:tabs>
+          <w:tab w:val="num" w:pos="1440"/>
+        </w:tabs>
+        <w:ind w:left="1440" w:hanging="360"/>
+      </w:pPr>
+      <w:rPr>
+        <w:rFonts w:ascii="Courier New" w:hAnsi="Courier New" w:hint="default"/>
+        <w:sz w:val="20"/>
+      </w:rPr>
+    </w:lvl>
+    <w:lvl w:ilvl="2" w:tentative="1">
+      <w:start w:val="1"/>
+      <w:numFmt w:val="bullet"/>
+      <w:lvlText w:val=""/>
+      <w:lvlJc w:val="left"/>
+      <w:pPr>
+        <w:tabs>
+          <w:tab w:val="num" w:pos="2160"/>
+        </w:tabs>
+        <w:ind w:left="2160" w:hanging="360"/>
+      </w:pPr>
+      <w:rPr>
+        <w:rFonts w:ascii="Wingdings" w:hAnsi="Wingdings" w:hint="default"/>
+        <w:sz w:val="20"/>
+      </w:rPr>
+    </w:lvl>
+    <w:lvl w:ilvl="3" w:tentative="1">
+      <w:start w:val="1"/>
+      <w:numFmt w:val="bullet"/>
+      <w:lvlText w:val=""/>
+      <w:lvlJc w:val="left"/>
+      <w:pPr>
+        <w:tabs>
+          <w:tab w:val="num" w:pos="2880"/>
+        </w:tabs>
+        <w:ind w:left="2880" w:hanging="360"/>
+      </w:pPr>
+      <w:rPr>
+        <w:rFonts w:ascii="Wingdings" w:hAnsi="Wingdings" w:hint="default"/>
+        <w:sz w:val="20"/>
+      </w:rPr>
+    </w:lvl>
+    <w:lvl w:ilvl="4" w:tentative="1">
+      <w:start w:val="1"/>
+      <w:numFmt w:val="bullet"/>
+      <w:lvlText w:val=""/>
+      <w:lvlJc w:val="left"/>
+      <w:pPr>
+        <w:tabs>
+          <w:tab w:val="num" w:pos="3600"/>
+        </w:tabs>
+        <w:ind w:left="3600" w:hanging="360"/>
+      </w:pPr>
+      <w:rPr>
+        <w:rFonts w:ascii="Wingdings" w:hAnsi="Wingdings" w:hint="default"/>
+        <w:sz w:val="20"/>
+      </w:rPr>
+    </w:lvl>
+    <w:lvl w:ilvl="5" w:tentative="1">
+      <w:start w:val="1"/>
+      <w:numFmt w:val="bullet"/>
+      <w:lvlText w:val=""/>
+      <w:lvlJc w:val="left"/>
+      <w:pPr>
+        <w:tabs>
+          <w:tab w:val="num" w:pos="4320"/>
+        </w:tabs>
+        <w:ind w:left="4320" w:hanging="360"/>
+      </w:pPr>
+      <w:rPr>
+        <w:rFonts w:ascii="Wingdings" w:hAnsi="Wingdings" w:hint="default"/>
+        <w:sz w:val="20"/>
+      </w:rPr>
+    </w:lvl>
+    <w:lvl w:ilvl="6" w:tentative="1">
+      <w:start w:val="1"/>
+      <w:numFmt w:val="bullet"/>
+      <w:lvlText w:val=""/>
+      <w:lvlJc w:val="left"/>
+      <w:pPr>
+        <w:tabs>
+          <w:tab w:val="num" w:pos="5040"/>
+        </w:tabs>
+        <w:ind w:left="5040" w:hanging="360"/>
+      </w:pPr>
+      <w:rPr>
+        <w:rFonts w:ascii="Wingdings" w:hAnsi="Wingdings" w:hint="default"/>
+        <w:sz w:val="20"/>
+      </w:rPr>
+    </w:lvl>
+    <w:lvl w:ilvl="7" w:tentative="1">
+      <w:start w:val="1"/>
+      <w:numFmt w:val="bullet"/>
+      <w:lvlText w:val=""/>
+      <w:lvlJc w:val="left"/>
+      <w:pPr>
+        <w:tabs>
+          <w:tab w:val="num" w:pos="5760"/>
+        </w:tabs>
+        <w:ind w:left="5760" w:hanging="360"/>
+      </w:pPr>
+      <w:rPr>
+        <w:rFonts w:ascii="Wingdings" w:hAnsi="Wingdings" w:hint="default"/>
+        <w:sz w:val="20"/>
+      </w:rPr>
+    </w:lvl>
+    <w:lvl w:ilvl="8" w:tentative="1">
+      <w:start w:val="1"/>
+      <w:numFmt w:val="bullet"/>
+      <w:lvlText w:val=""/>
+      <w:lvlJc w:val="left"/>
+      <w:pPr>
+        <w:tabs>
+          <w:tab w:val="num" w:pos="6480"/>
+        </w:tabs>
+        <w:ind w:left="6480" w:hanging="360"/>
+      </w:pPr>
+      <w:rPr>
+        <w:rFonts w:ascii="Wingdings" w:hAnsi="Wingdings" w:hint="default"/>
+        <w:sz w:val="20"/>
+      </w:rPr>
+    </w:lvl>
+  </w:abstractNum>
+  <w:abstractNum w:abstractNumId="4" w15:restartNumberingAfterBreak="0">
+    <w:nsid w:val="4BB645F1"/>
+    <w:multiLevelType w:val="multilevel"/>
+    <w:tmpl w:val="C570E4CA"/>
+    <w:lvl w:ilvl="0">
+      <w:start w:val="1"/>
+      <w:numFmt w:val="bullet"/>
+      <w:lvlText w:val=""/>
+      <w:lvlJc w:val="left"/>
+      <w:pPr>
+        <w:tabs>
+          <w:tab w:val="num" w:pos="720"/>
+        </w:tabs>
+        <w:ind w:left="720" w:hanging="360"/>
+      </w:pPr>
+      <w:rPr>
+        <w:rFonts w:ascii="Symbol" w:hAnsi="Symbol" w:hint="default"/>
+        <w:sz w:val="20"/>
+      </w:rPr>
+    </w:lvl>
+    <w:lvl w:ilvl="1" w:tentative="1">
+      <w:start w:val="1"/>
+      <w:numFmt w:val="bullet"/>
+      <w:lvlText w:val="o"/>
+      <w:lvlJc w:val="left"/>
+      <w:pPr>
+        <w:tabs>
+          <w:tab w:val="num" w:pos="1440"/>
+        </w:tabs>
+        <w:ind w:left="1440" w:hanging="360"/>
+      </w:pPr>
+      <w:rPr>
+        <w:rFonts w:ascii="Courier New" w:hAnsi="Courier New" w:hint="default"/>
+        <w:sz w:val="20"/>
+      </w:rPr>
+    </w:lvl>
+    <w:lvl w:ilvl="2" w:tentative="1">
+      <w:start w:val="1"/>
+      <w:numFmt w:val="bullet"/>
+      <w:lvlText w:val=""/>
+      <w:lvlJc w:val="left"/>
+      <w:pPr>
+        <w:tabs>
+          <w:tab w:val="num" w:pos="2160"/>
+        </w:tabs>
+        <w:ind w:left="2160" w:hanging="360"/>
+      </w:pPr>
+      <w:rPr>
+        <w:rFonts w:ascii="Wingdings" w:hAnsi="Wingdings" w:hint="default"/>
+        <w:sz w:val="20"/>
+      </w:rPr>
+    </w:lvl>
+    <w:lvl w:ilvl="3" w:tentative="1">
+      <w:start w:val="1"/>
+      <w:numFmt w:val="bullet"/>
+      <w:lvlText w:val=""/>
+      <w:lvlJc w:val="left"/>
+      <w:pPr>
+        <w:tabs>
+          <w:tab w:val="num" w:pos="2880"/>
+        </w:tabs>
+        <w:ind w:left="2880" w:hanging="360"/>
+      </w:pPr>
+      <w:rPr>
+        <w:rFonts w:ascii="Wingdings" w:hAnsi="Wingdings" w:hint="default"/>
+        <w:sz w:val="20"/>
+      </w:rPr>
+    </w:lvl>
+    <w:lvl w:ilvl="4" w:tentative="1">
+      <w:start w:val="1"/>
+      <w:numFmt w:val="bullet"/>
+      <w:lvlText w:val=""/>
+      <w:lvlJc w:val="left"/>
+      <w:pPr>
+        <w:tabs>
+          <w:tab w:val="num" w:pos="3600"/>
+        </w:tabs>
+        <w:ind w:left="3600" w:hanging="360"/>
+      </w:pPr>
+      <w:rPr>
+        <w:rFonts w:ascii="Wingdings" w:hAnsi="Wingdings" w:hint="default"/>
+        <w:sz w:val="20"/>
+      </w:rPr>
+    </w:lvl>
+    <w:lvl w:ilvl="5" w:tentative="1">
+      <w:start w:val="1"/>
+      <w:numFmt w:val="bullet"/>
+      <w:lvlText w:val=""/>
+      <w:lvlJc w:val="left"/>
+      <w:pPr>
+        <w:tabs>
+          <w:tab w:val="num" w:pos="4320"/>
+        </w:tabs>
+        <w:ind w:left="4320" w:hanging="360"/>
+      </w:pPr>
+      <w:rPr>
+        <w:rFonts w:ascii="Wingdings" w:hAnsi="Wingdings" w:hint="default"/>
+        <w:sz w:val="20"/>
+      </w:rPr>
+    </w:lvl>
+    <w:lvl w:ilvl="6" w:tentative="1">
+      <w:start w:val="1"/>
+      <w:numFmt w:val="bullet"/>
+      <w:lvlText w:val=""/>
+      <w:lvlJc w:val="left"/>
+      <w:pPr>
+        <w:tabs>
+          <w:tab w:val="num" w:pos="5040"/>
+        </w:tabs>
+        <w:ind w:left="5040" w:hanging="360"/>
+      </w:pPr>
+      <w:rPr>
+        <w:rFonts w:ascii="Wingdings" w:hAnsi="Wingdings" w:hint="default"/>
+        <w:sz w:val="20"/>
+      </w:rPr>
+    </w:lvl>
+    <w:lvl w:ilvl="7" w:tentative="1">
+      <w:start w:val="1"/>
+      <w:numFmt w:val="bullet"/>
+      <w:lvlText w:val=""/>
+      <w:lvlJc w:val="left"/>
+      <w:pPr>
+        <w:tabs>
+          <w:tab w:val="num" w:pos="5760"/>
+        </w:tabs>
+        <w:ind w:left="5760" w:hanging="360"/>
+      </w:pPr>
+      <w:rPr>
+        <w:rFonts w:ascii="Wingdings" w:hAnsi="Wingdings" w:hint="default"/>
+        <w:sz w:val="20"/>
+      </w:rPr>
+    </w:lvl>
+    <w:lvl w:ilvl="8" w:tentative="1">
+      <w:start w:val="1"/>
+      <w:numFmt w:val="bullet"/>
+      <w:lvlText w:val=""/>
+      <w:lvlJc w:val="left"/>
+      <w:pPr>
+        <w:tabs>
+          <w:tab w:val="num" w:pos="6480"/>
+        </w:tabs>
+        <w:ind w:left="6480" w:hanging="360"/>
+      </w:pPr>
+      <w:rPr>
+        <w:rFonts w:ascii="Wingdings" w:hAnsi="Wingdings" w:hint="default"/>
+        <w:sz w:val="20"/>
+      </w:rPr>
+    </w:lvl>
+  </w:abstractNum>
   <w:num w:numId="1" w16cid:durableId="1343124811">
     <w:abstractNumId w:val="0"/>
   </w:num>
   <w:num w:numId="2" w16cid:durableId="1270359402">
+    <w:abstractNumId w:val="3"/>
+  </w:num>
+  <w:num w:numId="3" w16cid:durableId="1476406851">
+    <w:abstractNumId w:val="2"/>
+  </w:num>
+  <w:num w:numId="4" w16cid:durableId="1002245405">
     <w:abstractNumId w:val="1"/>
+  </w:num>
+  <w:num w:numId="5" w16cid:durableId="2000843219">
+    <w:abstractNumId w:val="4"/>
   </w:num>
 </w:numbering>
 </file>

</xml_diff>